<commit_message>
Add Norse brainstorm, Aurora project assets, and review index
</commit_message>
<xml_diff>
--- a/Hiking_Trip/Cards-New.docx
+++ b/Hiking_Trip/Cards-New.docx
@@ -2,6 +2,7 @@
 <file path=word/document.xml><?xml version="1.0" encoding="utf-8"?>
 <w:document xmlns:wpc="http://schemas.microsoft.com/office/word/2010/wordprocessingCanvas" xmlns:cx="http://schemas.microsoft.com/office/drawing/2014/chartex" xmlns:cx1="http://schemas.microsoft.com/office/drawing/2015/9/8/chartex" xmlns:cx2="http://schemas.microsoft.com/office/drawing/2015/10/21/chartex" xmlns:cx3="http://schemas.microsoft.com/office/drawing/2016/5/9/chartex" xmlns:cx4="http://schemas.microsoft.com/office/drawing/2016/5/10/chartex" xmlns:cx5="http://schemas.microsoft.com/office/drawing/2016/5/11/chartex" xmlns:cx6="http://schemas.microsoft.com/office/drawing/2016/5/12/chartex" xmlns:cx7="http://schemas.microsoft.com/office/drawing/2016/5/13/chartex" xmlns:cx8="http://schemas.microsoft.com/office/drawing/2016/5/14/chartex" xmlns:mc="http://schemas.openxmlformats.org/markup-compatibility/2006" xmlns:aink="http://schemas.microsoft.com/office/drawing/2016/ink" xmlns:am3d="http://schemas.microsoft.com/office/drawing/2017/model3d" xmlns:o="urn:schemas-microsoft-com:office:office" xmlns:oel="http://schemas.microsoft.com/office/2019/extlst" xmlns:r="http://schemas.openxmlformats.org/officeDocument/2006/relationships" xmlns:m="http://schemas.openxmlformats.org/officeDocument/2006/math" xmlns:v="urn:schemas-microsoft-com:vml" xmlns:wp14="http://schemas.microsoft.com/office/word/2010/wordprocessingDrawing" xmlns:wp="http://schemas.openxmlformats.org/drawingml/2006/wordprocessingDrawing" xmlns:w10="urn:schemas-microsoft-com:office:word" xmlns:w="http://schemas.openxmlformats.org/wordprocessingml/2006/main" xmlns:w14="http://schemas.microsoft.com/office/word/2010/wordml" xmlns:w15="http://schemas.microsoft.com/office/word/2012/wordml" xmlns:w16cex="http://schemas.microsoft.com/office/word/2018/wordml/cex" xmlns:w16cid="http://schemas.microsoft.com/office/word/2016/wordml/cid" xmlns:w16="http://schemas.microsoft.com/office/word/2018/wordml" xmlns:w16du="http://schemas.microsoft.com/office/word/2023/wordml/word16du" xmlns:w16sdtdh="http://schemas.microsoft.com/office/word/2020/wordml/sdtdatahash" xmlns:w16sdtfl="http://schemas.microsoft.com/office/word/2024/wordml/sdtformatlock" xmlns:w16se="http://schemas.microsoft.com/office/word/2015/wordml/symex" xmlns:wpg="http://schemas.microsoft.com/office/word/2010/wordprocessingGroup" xmlns:wpi="http://schemas.microsoft.com/office/word/2010/wordprocessingInk" xmlns:wne="http://schemas.microsoft.com/office/word/2006/wordml" xmlns:wps="http://schemas.microsoft.com/office/word/2010/wordprocessingShape" mc:Ignorable="w14 w15 w16se w16cid w16 w16cex w16sdtdh w16sdtfl w16du wp14">
   <w:body>
+    <w:p/>
     <w:p>
       <w:r>
         <w:rPr>
@@ -10,18 +11,18 @@
         <mc:AlternateContent>
           <mc:Choice Requires="wps">
             <w:drawing>
-              <wp:anchor distT="45720" distB="45720" distL="114300" distR="114300" simplePos="0" relativeHeight="251671552" behindDoc="0" locked="0" layoutInCell="1" allowOverlap="1" wp14:anchorId="44C50F56" wp14:editId="5C99B454">
+              <wp:anchor distT="45720" distB="45720" distL="114300" distR="114300" simplePos="0" relativeHeight="251692032" behindDoc="0" locked="0" layoutInCell="1" allowOverlap="1" wp14:anchorId="7F8D9E7B" wp14:editId="5FE7C1FE">
                 <wp:simplePos x="0" y="0"/>
-                <wp:positionH relativeFrom="margin">
-                  <wp:posOffset>957732</wp:posOffset>
+                <wp:positionH relativeFrom="page">
+                  <wp:posOffset>1922780</wp:posOffset>
                 </wp:positionH>
                 <wp:positionV relativeFrom="paragraph">
-                  <wp:posOffset>3668186</wp:posOffset>
+                  <wp:posOffset>4090670</wp:posOffset>
                 </wp:positionV>
-                <wp:extent cx="2541905" cy="829310"/>
+                <wp:extent cx="1756410" cy="457200"/>
                 <wp:effectExtent l="0" t="0" r="0" b="0"/>
                 <wp:wrapSquare wrapText="bothSides"/>
-                <wp:docPr id="1748289155" name="Text Box 2"/>
+                <wp:docPr id="129982360" name="Text Box 2"/>
                 <wp:cNvGraphicFramePr>
                   <a:graphicFrameLocks xmlns:a="http://schemas.openxmlformats.org/drawingml/2006/main"/>
                 </wp:cNvGraphicFramePr>
@@ -34,7 +35,7 @@
                       <wps:spPr bwMode="auto">
                         <a:xfrm>
                           <a:off x="0" y="0"/>
-                          <a:ext cx="2541905" cy="829310"/>
+                          <a:ext cx="1756410" cy="457200"/>
                         </a:xfrm>
                         <a:prstGeom prst="rect">
                           <a:avLst/>
@@ -51,63 +52,14 @@
                         <w:txbxContent>
                           <w:p>
                             <w:pPr>
-                              <w:spacing w:line="180" w:lineRule="auto"/>
+                              <w:spacing w:after="0"/>
+                              <w:jc w:val="center"/>
                               <w:rPr>
                                 <w:rFonts w:ascii="Quantico" w:hAnsi="Quantico"/>
                                 <w:b/>
                                 <w:bCs/>
                                 <w:color w:val="FFFFFF" w:themeColor="background1"/>
-                                <w:sz w:val="28"/>
-                                <w:szCs w:val="32"/>
-                              </w:rPr>
-                            </w:pPr>
-                            <w:r>
-                              <w:rPr>
-                                <w:rFonts w:ascii="Quantico" w:hAnsi="Quantico"/>
-                                <w:b/>
-                                <w:bCs/>
-                                <w:color w:val="FFFFFF" w:themeColor="background1"/>
-                                <w:sz w:val="28"/>
-                                <w:szCs w:val="32"/>
-                              </w:rPr>
-                              <w:t>You completed the game!</w:t>
-                            </w:r>
-                          </w:p>
-                          <w:p>
-                            <w:pPr>
-                              <w:spacing w:line="180" w:lineRule="auto"/>
-                              <w:rPr>
-                                <w:rFonts w:ascii="Quantico" w:hAnsi="Quantico"/>
-                                <w:b/>
-                                <w:bCs/>
-                                <w:color w:val="FFFFFF" w:themeColor="background1"/>
-                                <w:sz w:val="26"/>
-                                <w:szCs w:val="28"/>
-                              </w:rPr>
-                            </w:pPr>
-                            <w:r>
-                              <w:rPr>
-                                <w:rFonts w:ascii="Quantico" w:hAnsi="Quantico"/>
-                                <w:b/>
-                                <w:bCs/>
-                                <w:color w:val="FFFFFF" w:themeColor="background1"/>
-                                <w:sz w:val="26"/>
-                                <w:szCs w:val="28"/>
-                              </w:rPr>
-                              <w:t xml:space="preserve">Feel free to keep the plushy! </w:t>
-                            </w:r>
-                          </w:p>
-                          <w:p>
-                            <w:pPr>
-                              <w:spacing w:line="180" w:lineRule="auto"/>
-                              <w:ind w:hanging="709"/>
-                              <w:jc w:val="right"/>
-                              <w:rPr>
-                                <w:rFonts w:ascii="Quantico" w:hAnsi="Quantico"/>
-                                <w:b/>
-                                <w:bCs/>
-                                <w:color w:val="FFFFFF" w:themeColor="background1"/>
-                                <w:sz w:val="12"/>
+                                <w:sz w:val="20"/>
                                 <w:szCs w:val="12"/>
                               </w:rPr>
                             </w:pPr>
@@ -117,10 +69,10 @@
                                 <w:b/>
                                 <w:bCs/>
                                 <w:color w:val="FFFFFF" w:themeColor="background1"/>
-                                <w:sz w:val="12"/>
+                                <w:sz w:val="20"/>
                                 <w:szCs w:val="12"/>
                               </w:rPr>
-                              <w:t>Let us know what you thought of the game by completing our survey</w:t>
+                              <w:t>If you want to reset the game for the next team</w:t>
                             </w:r>
                           </w:p>
                         </w:txbxContent>
@@ -142,72 +94,23 @@
           </mc:Choice>
           <mc:Fallback>
             <w:pict>
-              <v:shapetype w14:anchorId="44C50F56" id="_x0000_t202" coordsize="21600,21600" o:spt="202" path="m,l,21600r21600,l21600,xe">
+              <v:shapetype w14:anchorId="7F8D9E7B" id="_x0000_t202" coordsize="21600,21600" o:spt="202" path="m,l,21600r21600,l21600,xe">
                 <v:stroke joinstyle="miter"/>
                 <v:path gradientshapeok="t" o:connecttype="rect"/>
               </v:shapetype>
-              <v:shape id="Text Box 2" o:spid="_x0000_s1026" type="#_x0000_t202" style="position:absolute;margin-left:75.4pt;margin-top:288.85pt;width:200.15pt;height:65.3pt;z-index:251671552;visibility:visible;mso-wrap-style:square;mso-width-percent:0;mso-height-percent:0;mso-wrap-distance-left:9pt;mso-wrap-distance-top:3.6pt;mso-wrap-distance-right:9pt;mso-wrap-distance-bottom:3.6pt;mso-position-horizontal:absolute;mso-position-horizontal-relative:margin;mso-position-vertical:absolute;mso-position-vertical-relative:text;mso-width-percent:0;mso-height-percent:0;mso-width-relative:margin;mso-height-relative:margin;v-text-anchor:top" o:gfxdata="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" filled="f" stroked="f">
+              <v:shape id="Text Box 2" o:spid="_x0000_s1026" type="#_x0000_t202" style="position:absolute;margin-left:151.4pt;margin-top:322.1pt;width:138.3pt;height:36pt;z-index:251692032;visibility:visible;mso-wrap-style:square;mso-width-percent:0;mso-height-percent:0;mso-wrap-distance-left:9pt;mso-wrap-distance-top:3.6pt;mso-wrap-distance-right:9pt;mso-wrap-distance-bottom:3.6pt;mso-position-horizontal:absolute;mso-position-horizontal-relative:page;mso-position-vertical:absolute;mso-position-vertical-relative:text;mso-width-percent:0;mso-height-percent:0;mso-width-relative:margin;mso-height-relative:margin;v-text-anchor:top" o:gfxdata="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" filled="f" stroked="f">
                 <v:textbox>
                   <w:txbxContent>
                     <w:p>
                       <w:pPr>
-                        <w:spacing w:line="180" w:lineRule="auto"/>
+                        <w:spacing w:after="0"/>
+                        <w:jc w:val="center"/>
                         <w:rPr>
                           <w:rFonts w:ascii="Quantico" w:hAnsi="Quantico"/>
                           <w:b/>
                           <w:bCs/>
                           <w:color w:val="FFFFFF" w:themeColor="background1"/>
-                          <w:sz w:val="28"/>
-                          <w:szCs w:val="32"/>
-                        </w:rPr>
-                      </w:pPr>
-                      <w:r>
-                        <w:rPr>
-                          <w:rFonts w:ascii="Quantico" w:hAnsi="Quantico"/>
-                          <w:b/>
-                          <w:bCs/>
-                          <w:color w:val="FFFFFF" w:themeColor="background1"/>
-                          <w:sz w:val="28"/>
-                          <w:szCs w:val="32"/>
-                        </w:rPr>
-                        <w:t>You completed the game!</w:t>
-                      </w:r>
-                    </w:p>
-                    <w:p>
-                      <w:pPr>
-                        <w:spacing w:line="180" w:lineRule="auto"/>
-                        <w:rPr>
-                          <w:rFonts w:ascii="Quantico" w:hAnsi="Quantico"/>
-                          <w:b/>
-                          <w:bCs/>
-                          <w:color w:val="FFFFFF" w:themeColor="background1"/>
-                          <w:sz w:val="26"/>
-                          <w:szCs w:val="28"/>
-                        </w:rPr>
-                      </w:pPr>
-                      <w:r>
-                        <w:rPr>
-                          <w:rFonts w:ascii="Quantico" w:hAnsi="Quantico"/>
-                          <w:b/>
-                          <w:bCs/>
-                          <w:color w:val="FFFFFF" w:themeColor="background1"/>
-                          <w:sz w:val="26"/>
-                          <w:szCs w:val="28"/>
-                        </w:rPr>
-                        <w:t xml:space="preserve">Feel free to keep the plushy! </w:t>
-                      </w:r>
-                    </w:p>
-                    <w:p>
-                      <w:pPr>
-                        <w:spacing w:line="180" w:lineRule="auto"/>
-                        <w:ind w:hanging="709"/>
-                        <w:jc w:val="right"/>
-                        <w:rPr>
-                          <w:rFonts w:ascii="Quantico" w:hAnsi="Quantico"/>
-                          <w:b/>
-                          <w:bCs/>
-                          <w:color w:val="FFFFFF" w:themeColor="background1"/>
-                          <w:sz w:val="12"/>
+                          <w:sz w:val="20"/>
                           <w:szCs w:val="12"/>
                         </w:rPr>
                       </w:pPr>
@@ -217,15 +120,15 @@
                           <w:b/>
                           <w:bCs/>
                           <w:color w:val="FFFFFF" w:themeColor="background1"/>
-                          <w:sz w:val="12"/>
+                          <w:sz w:val="20"/>
                           <w:szCs w:val="12"/>
                         </w:rPr>
-                        <w:t>Let us know what you thought of the game by completing our survey</w:t>
+                        <w:t>If you want to reset the game for the next team</w:t>
                       </w:r>
                     </w:p>
                   </w:txbxContent>
                 </v:textbox>
-                <w10:wrap type="square" anchorx="margin"/>
+                <w10:wrap type="square" anchorx="page"/>
               </v:shape>
             </w:pict>
           </mc:Fallback>
@@ -238,18 +141,18 @@
         <mc:AlternateContent>
           <mc:Choice Requires="wps">
             <w:drawing>
-              <wp:anchor distT="45720" distB="45720" distL="114300" distR="114300" simplePos="0" relativeHeight="251674624" behindDoc="0" locked="0" layoutInCell="1" allowOverlap="1" wp14:anchorId="4B6EA5CC" wp14:editId="31F7C8C5">
+              <wp:anchor distT="45720" distB="45720" distL="114300" distR="114300" simplePos="0" relativeHeight="251686912" behindDoc="0" locked="0" layoutInCell="1" allowOverlap="1" wp14:anchorId="1FD9174B" wp14:editId="479A740A">
                 <wp:simplePos x="0" y="0"/>
-                <wp:positionH relativeFrom="margin">
-                  <wp:posOffset>1197563</wp:posOffset>
+                <wp:positionH relativeFrom="page">
+                  <wp:posOffset>2119630</wp:posOffset>
                 </wp:positionH>
                 <wp:positionV relativeFrom="paragraph">
-                  <wp:posOffset>2969705</wp:posOffset>
+                  <wp:posOffset>3703320</wp:posOffset>
                 </wp:positionV>
-                <wp:extent cx="2259965" cy="742950"/>
+                <wp:extent cx="1884680" cy="457200"/>
                 <wp:effectExtent l="0" t="0" r="0" b="0"/>
                 <wp:wrapSquare wrapText="bothSides"/>
-                <wp:docPr id="1781807364" name="Text Box 2"/>
+                <wp:docPr id="720206550" name="Text Box 2"/>
                 <wp:cNvGraphicFramePr>
                   <a:graphicFrameLocks xmlns:a="http://schemas.openxmlformats.org/drawingml/2006/main"/>
                 </wp:cNvGraphicFramePr>
@@ -262,7 +165,7 @@
                       <wps:spPr bwMode="auto">
                         <a:xfrm>
                           <a:off x="0" y="0"/>
-                          <a:ext cx="2259965" cy="742950"/>
+                          <a:ext cx="1884680" cy="457200"/>
                         </a:xfrm>
                         <a:prstGeom prst="rect">
                           <a:avLst/>
@@ -279,17 +182,15 @@
                         <w:txbxContent>
                           <w:p>
                             <w:pPr>
-                              <w:spacing w:after="0" w:line="168" w:lineRule="auto"/>
+                              <w:spacing w:after="0"/>
                               <w:jc w:val="center"/>
                               <w:rPr>
                                 <w:rFonts w:ascii="Quantico" w:hAnsi="Quantico"/>
                                 <w:b/>
                                 <w:bCs/>
                                 <w:color w:val="FFFFFF" w:themeColor="background1"/>
-                                <w:sz w:val="38"/>
-                                <w:szCs w:val="40"/>
-                                <w:u w:val="single"/>
-                                <w:lang w:val="en-US"/>
+                                <w:sz w:val="20"/>
+                                <w:szCs w:val="12"/>
                               </w:rPr>
                             </w:pPr>
                             <w:r>
@@ -298,141 +199,10 @@
                                 <w:b/>
                                 <w:bCs/>
                                 <w:color w:val="FFFFFF" w:themeColor="background1"/>
-                                <w:sz w:val="38"/>
-                                <w:szCs w:val="40"/>
-                                <w:u w:val="single"/>
-                                <w:lang w:val="en-US"/>
+                                <w:sz w:val="20"/>
+                                <w:szCs w:val="12"/>
                               </w:rPr>
-                              <w:t xml:space="preserve">Hiking Backpack </w:t>
-                            </w:r>
-                          </w:p>
-                        </w:txbxContent>
-                      </wps:txbx>
-                      <wps:bodyPr rot="0" vert="horz" wrap="square" lIns="91440" tIns="45720" rIns="91440" bIns="45720" anchor="ctr" anchorCtr="0">
-                        <a:noAutofit/>
-                      </wps:bodyPr>
-                    </wps:wsp>
-                  </a:graphicData>
-                </a:graphic>
-                <wp14:sizeRelH relativeFrom="margin">
-                  <wp14:pctWidth>0</wp14:pctWidth>
-                </wp14:sizeRelH>
-                <wp14:sizeRelV relativeFrom="margin">
-                  <wp14:pctHeight>0</wp14:pctHeight>
-                </wp14:sizeRelV>
-              </wp:anchor>
-            </w:drawing>
-          </mc:Choice>
-          <mc:Fallback>
-            <w:pict>
-              <v:shape w14:anchorId="4B6EA5CC" id="_x0000_s1027" type="#_x0000_t202" style="position:absolute;margin-left:94.3pt;margin-top:233.85pt;width:177.95pt;height:58.5pt;z-index:251674624;visibility:visible;mso-wrap-style:square;mso-width-percent:0;mso-height-percent:0;mso-wrap-distance-left:9pt;mso-wrap-distance-top:3.6pt;mso-wrap-distance-right:9pt;mso-wrap-distance-bottom:3.6pt;mso-position-horizontal:absolute;mso-position-horizontal-relative:margin;mso-position-vertical:absolute;mso-position-vertical-relative:text;mso-width-percent:0;mso-height-percent:0;mso-width-relative:margin;mso-height-relative:margin;v-text-anchor:middle" o:gfxdata="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" filled="f" stroked="f">
-                <v:textbox>
-                  <w:txbxContent>
-                    <w:p>
-                      <w:pPr>
-                        <w:spacing w:after="0" w:line="168" w:lineRule="auto"/>
-                        <w:jc w:val="center"/>
-                        <w:rPr>
-                          <w:rFonts w:ascii="Quantico" w:hAnsi="Quantico"/>
-                          <w:b/>
-                          <w:bCs/>
-                          <w:color w:val="FFFFFF" w:themeColor="background1"/>
-                          <w:sz w:val="38"/>
-                          <w:szCs w:val="40"/>
-                          <w:u w:val="single"/>
-                          <w:lang w:val="en-US"/>
-                        </w:rPr>
-                      </w:pPr>
-                      <w:r>
-                        <w:rPr>
-                          <w:rFonts w:ascii="Quantico" w:hAnsi="Quantico"/>
-                          <w:b/>
-                          <w:bCs/>
-                          <w:color w:val="FFFFFF" w:themeColor="background1"/>
-                          <w:sz w:val="38"/>
-                          <w:szCs w:val="40"/>
-                          <w:u w:val="single"/>
-                          <w:lang w:val="en-US"/>
-                        </w:rPr>
-                        <w:t xml:space="preserve">Hiking Backpack </w:t>
-                      </w:r>
-                    </w:p>
-                  </w:txbxContent>
-                </v:textbox>
-                <w10:wrap type="square" anchorx="margin"/>
-              </v:shape>
-            </w:pict>
-          </mc:Fallback>
-        </mc:AlternateContent>
-      </w:r>
-      <w:r>
-        <w:rPr>
-          <w:noProof/>
-        </w:rPr>
-        <mc:AlternateContent>
-          <mc:Choice Requires="wps">
-            <w:drawing>
-              <wp:anchor distT="45720" distB="45720" distL="114300" distR="114300" simplePos="0" relativeHeight="251672576" behindDoc="0" locked="0" layoutInCell="1" allowOverlap="1" wp14:anchorId="711B291C" wp14:editId="5667E0BE">
-                <wp:simplePos x="0" y="0"/>
-                <wp:positionH relativeFrom="margin">
-                  <wp:posOffset>696566</wp:posOffset>
-                </wp:positionH>
-                <wp:positionV relativeFrom="paragraph">
-                  <wp:posOffset>2552691</wp:posOffset>
-                </wp:positionV>
-                <wp:extent cx="2632075" cy="537210"/>
-                <wp:effectExtent l="0" t="0" r="0" b="0"/>
-                <wp:wrapSquare wrapText="bothSides"/>
-                <wp:docPr id="2044505726" name="Text Box 2"/>
-                <wp:cNvGraphicFramePr>
-                  <a:graphicFrameLocks xmlns:a="http://schemas.openxmlformats.org/drawingml/2006/main"/>
-                </wp:cNvGraphicFramePr>
-                <a:graphic xmlns:a="http://schemas.openxmlformats.org/drawingml/2006/main">
-                  <a:graphicData uri="http://schemas.microsoft.com/office/word/2010/wordprocessingShape">
-                    <wps:wsp>
-                      <wps:cNvSpPr txBox="1">
-                        <a:spLocks noChangeArrowheads="1"/>
-                      </wps:cNvSpPr>
-                      <wps:spPr bwMode="auto">
-                        <a:xfrm>
-                          <a:off x="0" y="0"/>
-                          <a:ext cx="2632075" cy="537210"/>
-                        </a:xfrm>
-                        <a:prstGeom prst="rect">
-                          <a:avLst/>
-                        </a:prstGeom>
-                        <a:noFill/>
-                        <a:ln w="9525">
-                          <a:noFill/>
-                          <a:miter lim="800000"/>
-                          <a:headEnd/>
-                          <a:tailEnd/>
-                        </a:ln>
-                      </wps:spPr>
-                      <wps:txbx>
-                        <w:txbxContent>
-                          <w:p>
-                            <w:pPr>
-                              <w:jc w:val="center"/>
-                              <w:rPr>
-                                <w:rFonts w:ascii="Quantico" w:hAnsi="Quantico"/>
-                                <w:b/>
-                                <w:bCs/>
-                                <w:color w:val="FFFFFF" w:themeColor="background1"/>
-                                <w:sz w:val="46"/>
-                                <w:szCs w:val="52"/>
-                              </w:rPr>
-                            </w:pPr>
-                            <w:r>
-                              <w:rPr>
-                                <w:rFonts w:ascii="Quantico" w:hAnsi="Quantico"/>
-                                <w:b/>
-                                <w:bCs/>
-                                <w:color w:val="FFFFFF" w:themeColor="background1"/>
-                                <w:sz w:val="46"/>
-                                <w:szCs w:val="52"/>
-                              </w:rPr>
-                              <w:t>Congratulations!</w:t>
+                              <w:t>Please let us know what you thought of the game</w:t>
                             </w:r>
                           </w:p>
                         </w:txbxContent>
@@ -454,19 +224,20 @@
           </mc:Choice>
           <mc:Fallback>
             <w:pict>
-              <v:shape w14:anchorId="711B291C" id="_x0000_s1028" type="#_x0000_t202" style="position:absolute;margin-left:54.85pt;margin-top:201pt;width:207.25pt;height:42.3pt;z-index:251672576;visibility:visible;mso-wrap-style:square;mso-width-percent:0;mso-height-percent:0;mso-wrap-distance-left:9pt;mso-wrap-distance-top:3.6pt;mso-wrap-distance-right:9pt;mso-wrap-distance-bottom:3.6pt;mso-position-horizontal:absolute;mso-position-horizontal-relative:margin;mso-position-vertical:absolute;mso-position-vertical-relative:text;mso-width-percent:0;mso-height-percent:0;mso-width-relative:margin;mso-height-relative:margin;v-text-anchor:top" o:gfxdata="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" filled="f" stroked="f">
+              <v:shape w14:anchorId="1FD9174B" id="_x0000_s1027" type="#_x0000_t202" style="position:absolute;margin-left:166.9pt;margin-top:291.6pt;width:148.4pt;height:36pt;z-index:251686912;visibility:visible;mso-wrap-style:square;mso-width-percent:0;mso-height-percent:0;mso-wrap-distance-left:9pt;mso-wrap-distance-top:3.6pt;mso-wrap-distance-right:9pt;mso-wrap-distance-bottom:3.6pt;mso-position-horizontal:absolute;mso-position-horizontal-relative:page;mso-position-vertical:absolute;mso-position-vertical-relative:text;mso-width-percent:0;mso-height-percent:0;mso-width-relative:margin;mso-height-relative:margin;v-text-anchor:top" o:gfxdata="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" filled="f" stroked="f">
                 <v:textbox>
                   <w:txbxContent>
                     <w:p>
                       <w:pPr>
+                        <w:spacing w:after="0"/>
                         <w:jc w:val="center"/>
                         <w:rPr>
                           <w:rFonts w:ascii="Quantico" w:hAnsi="Quantico"/>
                           <w:b/>
                           <w:bCs/>
                           <w:color w:val="FFFFFF" w:themeColor="background1"/>
-                          <w:sz w:val="46"/>
-                          <w:szCs w:val="52"/>
+                          <w:sz w:val="20"/>
+                          <w:szCs w:val="12"/>
                         </w:rPr>
                       </w:pPr>
                       <w:r>
@@ -475,10 +246,593 @@
                           <w:b/>
                           <w:bCs/>
                           <w:color w:val="FFFFFF" w:themeColor="background1"/>
-                          <w:sz w:val="46"/>
-                          <w:szCs w:val="52"/>
+                          <w:sz w:val="20"/>
+                          <w:szCs w:val="12"/>
+                        </w:rPr>
+                        <w:t>Please let us know what you thought of the game</w:t>
+                      </w:r>
+                    </w:p>
+                  </w:txbxContent>
+                </v:textbox>
+                <w10:wrap type="square" anchorx="page"/>
+              </v:shape>
+            </w:pict>
+          </mc:Fallback>
+        </mc:AlternateContent>
+      </w:r>
+      <w:r>
+        <w:rPr>
+          <w:noProof/>
+        </w:rPr>
+        <mc:AlternateContent>
+          <mc:Choice Requires="wps">
+            <w:drawing>
+              <wp:anchor distT="0" distB="0" distL="114300" distR="114300" simplePos="0" relativeHeight="251693056" behindDoc="0" locked="0" layoutInCell="1" allowOverlap="1" wp14:anchorId="1021C363" wp14:editId="59A9392C">
+                <wp:simplePos x="0" y="0"/>
+                <wp:positionH relativeFrom="column">
+                  <wp:posOffset>1273810</wp:posOffset>
+                </wp:positionH>
+                <wp:positionV relativeFrom="paragraph">
+                  <wp:posOffset>4114134</wp:posOffset>
+                </wp:positionV>
+                <wp:extent cx="1484630" cy="0"/>
+                <wp:effectExtent l="0" t="0" r="0" b="0"/>
+                <wp:wrapNone/>
+                <wp:docPr id="151241172" name="Straight Connector 15"/>
+                <wp:cNvGraphicFramePr/>
+                <a:graphic xmlns:a="http://schemas.openxmlformats.org/drawingml/2006/main">
+                  <a:graphicData uri="http://schemas.microsoft.com/office/word/2010/wordprocessingShape">
+                    <wps:wsp>
+                      <wps:cNvCnPr/>
+                      <wps:spPr>
+                        <a:xfrm>
+                          <a:off x="0" y="0"/>
+                          <a:ext cx="1484630" cy="0"/>
+                        </a:xfrm>
+                        <a:prstGeom prst="line">
+                          <a:avLst/>
+                        </a:prstGeom>
+                        <a:ln w="3175">
+                          <a:solidFill>
+                            <a:schemeClr val="bg1"/>
+                          </a:solidFill>
+                        </a:ln>
+                      </wps:spPr>
+                      <wps:style>
+                        <a:lnRef idx="2">
+                          <a:schemeClr val="accent1"/>
+                        </a:lnRef>
+                        <a:fillRef idx="0">
+                          <a:schemeClr val="accent1"/>
+                        </a:fillRef>
+                        <a:effectRef idx="1">
+                          <a:schemeClr val="accent1"/>
+                        </a:effectRef>
+                        <a:fontRef idx="minor">
+                          <a:schemeClr val="tx1"/>
+                        </a:fontRef>
+                      </wps:style>
+                      <wps:bodyPr/>
+                    </wps:wsp>
+                  </a:graphicData>
+                </a:graphic>
+                <wp14:sizeRelH relativeFrom="margin">
+                  <wp14:pctWidth>0</wp14:pctWidth>
+                </wp14:sizeRelH>
+                <wp14:sizeRelV relativeFrom="margin">
+                  <wp14:pctHeight>0</wp14:pctHeight>
+                </wp14:sizeRelV>
+              </wp:anchor>
+            </w:drawing>
+          </mc:Choice>
+          <mc:Fallback>
+            <w:pict>
+              <v:line w14:anchorId="3281ABC7" id="Straight Connector 15" o:spid="_x0000_s1026" style="position:absolute;z-index:251693056;visibility:visible;mso-wrap-style:square;mso-width-percent:0;mso-height-percent:0;mso-wrap-distance-left:9pt;mso-wrap-distance-top:0;mso-wrap-distance-right:9pt;mso-wrap-distance-bottom:0;mso-position-horizontal:absolute;mso-position-horizontal-relative:text;mso-position-vertical:absolute;mso-position-vertical-relative:text;mso-width-percent:0;mso-height-percent:0;mso-width-relative:margin;mso-height-relative:margin" from="100.3pt,323.95pt" to="217.2pt,323.95pt" o:gfxdata="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" strokecolor="white [3212]" strokeweight=".25pt">
+                <v:stroke joinstyle="miter"/>
+              </v:line>
+            </w:pict>
+          </mc:Fallback>
+        </mc:AlternateContent>
+      </w:r>
+      <w:r>
+        <w:rPr>
+          <w:noProof/>
+        </w:rPr>
+        <w:drawing>
+          <wp:anchor distT="0" distB="0" distL="114300" distR="114300" simplePos="0" relativeHeight="251689984" behindDoc="0" locked="0" layoutInCell="1" allowOverlap="1" wp14:anchorId="7482D4DB" wp14:editId="168AC90E">
+            <wp:simplePos x="0" y="0"/>
+            <wp:positionH relativeFrom="column">
+              <wp:posOffset>2630170</wp:posOffset>
+            </wp:positionH>
+            <wp:positionV relativeFrom="paragraph">
+              <wp:posOffset>4157854</wp:posOffset>
+            </wp:positionV>
+            <wp:extent cx="252000" cy="252000"/>
+            <wp:effectExtent l="0" t="0" r="0" b="0"/>
+            <wp:wrapNone/>
+            <wp:docPr id="840726893" name="Graphic 14" descr="Arrow: Slight curve with solid fill"/>
+            <wp:cNvGraphicFramePr>
+              <a:graphicFrameLocks xmlns:a="http://schemas.openxmlformats.org/drawingml/2006/main" noChangeAspect="1"/>
+            </wp:cNvGraphicFramePr>
+            <a:graphic xmlns:a="http://schemas.openxmlformats.org/drawingml/2006/main">
+              <a:graphicData uri="http://schemas.openxmlformats.org/drawingml/2006/picture">
+                <pic:pic xmlns:pic="http://schemas.openxmlformats.org/drawingml/2006/picture">
+                  <pic:nvPicPr>
+                    <pic:cNvPr id="1436845792" name="Graphic 1436845792" descr="Arrow: Slight curve with solid fill"/>
+                    <pic:cNvPicPr/>
+                  </pic:nvPicPr>
+                  <pic:blipFill>
+                    <a:blip r:embed="rId4">
+                      <a:extLst>
+                        <a:ext uri="{96DAC541-7B7A-43D3-8B79-37D633B846F1}">
+                          <asvg:svgBlip xmlns:asvg="http://schemas.microsoft.com/office/drawing/2016/SVG/main" r:embed="rId5"/>
+                        </a:ext>
+                      </a:extLst>
+                    </a:blip>
+                    <a:stretch>
+                      <a:fillRect/>
+                    </a:stretch>
+                  </pic:blipFill>
+                  <pic:spPr>
+                    <a:xfrm>
+                      <a:off x="0" y="0"/>
+                      <a:ext cx="252000" cy="252000"/>
+                    </a:xfrm>
+                    <a:prstGeom prst="rect">
+                      <a:avLst/>
+                    </a:prstGeom>
+                  </pic:spPr>
+                </pic:pic>
+              </a:graphicData>
+            </a:graphic>
+            <wp14:sizeRelH relativeFrom="page">
+              <wp14:pctWidth>0</wp14:pctWidth>
+            </wp14:sizeRelH>
+            <wp14:sizeRelV relativeFrom="page">
+              <wp14:pctHeight>0</wp14:pctHeight>
+            </wp14:sizeRelV>
+          </wp:anchor>
+        </w:drawing>
+      </w:r>
+      <w:r>
+        <w:rPr>
+          <w:noProof/>
+        </w:rPr>
+        <w:drawing>
+          <wp:anchor distT="0" distB="0" distL="114300" distR="114300" simplePos="0" relativeHeight="251687936" behindDoc="0" locked="0" layoutInCell="1" allowOverlap="1" wp14:anchorId="3C6D9460" wp14:editId="6F78ACC6">
+            <wp:simplePos x="0" y="0"/>
+            <wp:positionH relativeFrom="column">
+              <wp:posOffset>1165855</wp:posOffset>
+            </wp:positionH>
+            <wp:positionV relativeFrom="paragraph">
+              <wp:posOffset>3792220</wp:posOffset>
+            </wp:positionV>
+            <wp:extent cx="252000" cy="252000"/>
+            <wp:effectExtent l="0" t="0" r="0" b="0"/>
+            <wp:wrapNone/>
+            <wp:docPr id="1436845792" name="Graphic 14" descr="Arrow: Slight curve with solid fill"/>
+            <wp:cNvGraphicFramePr>
+              <a:graphicFrameLocks xmlns:a="http://schemas.openxmlformats.org/drawingml/2006/main" noChangeAspect="1"/>
+            </wp:cNvGraphicFramePr>
+            <a:graphic xmlns:a="http://schemas.openxmlformats.org/drawingml/2006/main">
+              <a:graphicData uri="http://schemas.openxmlformats.org/drawingml/2006/picture">
+                <pic:pic xmlns:pic="http://schemas.openxmlformats.org/drawingml/2006/picture">
+                  <pic:nvPicPr>
+                    <pic:cNvPr id="1436845792" name="Graphic 1436845792" descr="Arrow: Slight curve with solid fill"/>
+                    <pic:cNvPicPr/>
+                  </pic:nvPicPr>
+                  <pic:blipFill>
+                    <a:blip r:embed="rId4">
+                      <a:extLst>
+                        <a:ext uri="{96DAC541-7B7A-43D3-8B79-37D633B846F1}">
+                          <asvg:svgBlip xmlns:asvg="http://schemas.microsoft.com/office/drawing/2016/SVG/main" r:embed="rId5"/>
+                        </a:ext>
+                      </a:extLst>
+                    </a:blip>
+                    <a:stretch>
+                      <a:fillRect/>
+                    </a:stretch>
+                  </pic:blipFill>
+                  <pic:spPr>
+                    <a:xfrm rot="10800000">
+                      <a:off x="0" y="0"/>
+                      <a:ext cx="252000" cy="252000"/>
+                    </a:xfrm>
+                    <a:prstGeom prst="rect">
+                      <a:avLst/>
+                    </a:prstGeom>
+                  </pic:spPr>
+                </pic:pic>
+              </a:graphicData>
+            </a:graphic>
+            <wp14:sizeRelH relativeFrom="page">
+              <wp14:pctWidth>0</wp14:pctWidth>
+            </wp14:sizeRelH>
+            <wp14:sizeRelV relativeFrom="page">
+              <wp14:pctHeight>0</wp14:pctHeight>
+            </wp14:sizeRelV>
+          </wp:anchor>
+        </w:drawing>
+      </w:r>
+      <w:r>
+        <w:rPr>
+          <w:noProof/>
+        </w:rPr>
+        <mc:AlternateContent>
+          <mc:Choice Requires="wps">
+            <w:drawing>
+              <wp:anchor distT="0" distB="0" distL="114300" distR="114300" simplePos="0" relativeHeight="251684864" behindDoc="0" locked="0" layoutInCell="1" allowOverlap="1" wp14:anchorId="2A167F47" wp14:editId="0A05A4B9">
+                <wp:simplePos x="0" y="0"/>
+                <wp:positionH relativeFrom="column">
+                  <wp:posOffset>1099546</wp:posOffset>
+                </wp:positionH>
+                <wp:positionV relativeFrom="paragraph">
+                  <wp:posOffset>3726143</wp:posOffset>
+                </wp:positionV>
+                <wp:extent cx="1847693" cy="773430"/>
+                <wp:effectExtent l="0" t="0" r="635" b="7620"/>
+                <wp:wrapNone/>
+                <wp:docPr id="200985992" name="Rectangle: Rounded Corners 4"/>
+                <wp:cNvGraphicFramePr/>
+                <a:graphic xmlns:a="http://schemas.openxmlformats.org/drawingml/2006/main">
+                  <a:graphicData uri="http://schemas.microsoft.com/office/word/2010/wordprocessingShape">
+                    <wps:wsp>
+                      <wps:cNvSpPr/>
+                      <wps:spPr>
+                        <a:xfrm>
+                          <a:off x="0" y="0"/>
+                          <a:ext cx="1847693" cy="773430"/>
+                        </a:xfrm>
+                        <a:prstGeom prst="roundRect">
+                          <a:avLst/>
+                        </a:prstGeom>
+                        <a:solidFill>
+                          <a:srgbClr val="0E2841">
+                            <a:alpha val="85098"/>
+                          </a:srgbClr>
+                        </a:solidFill>
+                        <a:ln>
+                          <a:noFill/>
+                        </a:ln>
+                      </wps:spPr>
+                      <wps:style>
+                        <a:lnRef idx="2">
+                          <a:schemeClr val="accent1">
+                            <a:shade val="15000"/>
+                          </a:schemeClr>
+                        </a:lnRef>
+                        <a:fillRef idx="1">
+                          <a:schemeClr val="accent1"/>
+                        </a:fillRef>
+                        <a:effectRef idx="0">
+                          <a:schemeClr val="accent1"/>
+                        </a:effectRef>
+                        <a:fontRef idx="minor">
+                          <a:schemeClr val="lt1"/>
+                        </a:fontRef>
+                      </wps:style>
+                      <wps:bodyPr rot="0" spcFirstLastPara="0" vertOverflow="overflow" horzOverflow="overflow" vert="horz" wrap="square" lIns="91440" tIns="45720" rIns="91440" bIns="45720" numCol="1" spcCol="0" rtlCol="0" fromWordArt="0" anchor="ctr" anchorCtr="0" forceAA="0" compatLnSpc="1">
+                        <a:prstTxWarp prst="textNoShape">
+                          <a:avLst/>
+                        </a:prstTxWarp>
+                        <a:noAutofit/>
+                      </wps:bodyPr>
+                    </wps:wsp>
+                  </a:graphicData>
+                </a:graphic>
+                <wp14:sizeRelH relativeFrom="margin">
+                  <wp14:pctWidth>0</wp14:pctWidth>
+                </wp14:sizeRelH>
+                <wp14:sizeRelV relativeFrom="margin">
+                  <wp14:pctHeight>0</wp14:pctHeight>
+                </wp14:sizeRelV>
+              </wp:anchor>
+            </w:drawing>
+          </mc:Choice>
+          <mc:Fallback>
+            <w:pict>
+              <v:roundrect w14:anchorId="2AAFC05B" id="Rectangle: Rounded Corners 4" o:spid="_x0000_s1026" style="position:absolute;margin-left:86.6pt;margin-top:293.4pt;width:145.5pt;height:60.9pt;z-index:251684864;visibility:visible;mso-wrap-style:square;mso-width-percent:0;mso-height-percent:0;mso-wrap-distance-left:9pt;mso-wrap-distance-top:0;mso-wrap-distance-right:9pt;mso-wrap-distance-bottom:0;mso-position-horizontal:absolute;mso-position-horizontal-relative:text;mso-position-vertical:absolute;mso-position-vertical-relative:text;mso-width-percent:0;mso-height-percent:0;mso-width-relative:margin;mso-height-relative:margin;v-text-anchor:middle" arcsize="10923f" o:gfxdata="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" fillcolor="#0e2841" stroked="f" strokeweight="1.5pt">
+                <v:fill opacity="55769f"/>
+                <v:stroke joinstyle="miter"/>
+              </v:roundrect>
+            </w:pict>
+          </mc:Fallback>
+        </mc:AlternateContent>
+      </w:r>
+      <w:r>
+        <w:rPr>
+          <w:noProof/>
+        </w:rPr>
+        <mc:AlternateContent>
+          <mc:Choice Requires="wps">
+            <w:drawing>
+              <wp:anchor distT="45720" distB="45720" distL="114300" distR="114300" simplePos="0" relativeHeight="251672576" behindDoc="0" locked="0" layoutInCell="1" allowOverlap="1" wp14:anchorId="711B291C" wp14:editId="0CB8DAE1">
+                <wp:simplePos x="0" y="0"/>
+                <wp:positionH relativeFrom="margin">
+                  <wp:posOffset>615315</wp:posOffset>
+                </wp:positionH>
+                <wp:positionV relativeFrom="paragraph">
+                  <wp:posOffset>2456180</wp:posOffset>
+                </wp:positionV>
+                <wp:extent cx="3071495" cy="1193800"/>
+                <wp:effectExtent l="0" t="0" r="0" b="6350"/>
+                <wp:wrapSquare wrapText="bothSides"/>
+                <wp:docPr id="2044505726" name="Text Box 2"/>
+                <wp:cNvGraphicFramePr>
+                  <a:graphicFrameLocks xmlns:a="http://schemas.openxmlformats.org/drawingml/2006/main"/>
+                </wp:cNvGraphicFramePr>
+                <a:graphic xmlns:a="http://schemas.openxmlformats.org/drawingml/2006/main">
+                  <a:graphicData uri="http://schemas.microsoft.com/office/word/2010/wordprocessingShape">
+                    <wps:wsp>
+                      <wps:cNvSpPr txBox="1">
+                        <a:spLocks noChangeArrowheads="1"/>
+                      </wps:cNvSpPr>
+                      <wps:spPr bwMode="auto">
+                        <a:xfrm>
+                          <a:off x="0" y="0"/>
+                          <a:ext cx="3071495" cy="1193800"/>
+                        </a:xfrm>
+                        <a:prstGeom prst="rect">
+                          <a:avLst/>
+                        </a:prstGeom>
+                        <a:noFill/>
+                        <a:ln w="9525">
+                          <a:noFill/>
+                          <a:miter lim="800000"/>
+                          <a:headEnd/>
+                          <a:tailEnd/>
+                        </a:ln>
+                      </wps:spPr>
+                      <wps:txbx>
+                        <w:txbxContent>
+                          <w:p>
+                            <w:pPr>
+                              <w:spacing w:after="0" w:line="240" w:lineRule="auto"/>
+                              <w:jc w:val="center"/>
+                              <w:rPr>
+                                <w:rFonts w:ascii="Quantico" w:hAnsi="Quantico"/>
+                                <w:b/>
+                                <w:bCs/>
+                                <w:color w:val="FFFFFF" w:themeColor="background1"/>
+                                <w:sz w:val="54"/>
+                                <w:szCs w:val="144"/>
+                              </w:rPr>
+                            </w:pPr>
+                            <w:r>
+                              <w:rPr>
+                                <w:rFonts w:ascii="Quantico" w:hAnsi="Quantico"/>
+                                <w:b/>
+                                <w:bCs/>
+                                <w:color w:val="FFFFFF" w:themeColor="background1"/>
+                                <w:sz w:val="54"/>
+                                <w:szCs w:val="144"/>
+                              </w:rPr>
+                              <w:t>Congratulations!</w:t>
+                            </w:r>
+                          </w:p>
+                          <w:p>
+                            <w:pPr>
+                              <w:spacing w:after="0" w:line="240" w:lineRule="auto"/>
+                              <w:jc w:val="center"/>
+                              <w:rPr>
+                                <w:rFonts w:ascii="Quantico" w:hAnsi="Quantico"/>
+                                <w:b/>
+                                <w:bCs/>
+                                <w:color w:val="FFFFFF" w:themeColor="background1"/>
+                                <w:sz w:val="30"/>
+                                <w:szCs w:val="22"/>
+                              </w:rPr>
+                            </w:pPr>
+                            <w:r>
+                              <w:rPr>
+                                <w:rFonts w:ascii="Quantico" w:hAnsi="Quantico"/>
+                                <w:b/>
+                                <w:bCs/>
+                                <w:color w:val="FFFFFF" w:themeColor="background1"/>
+                                <w:sz w:val="30"/>
+                                <w:szCs w:val="22"/>
+                              </w:rPr>
+                              <w:t>You completed the game!</w:t>
+                            </w:r>
+                          </w:p>
+                          <w:p>
+                            <w:pPr>
+                              <w:spacing w:after="0" w:line="240" w:lineRule="auto"/>
+                              <w:jc w:val="center"/>
+                              <w:rPr>
+                                <w:rFonts w:ascii="Quantico" w:hAnsi="Quantico"/>
+                                <w:color w:val="FFFFFF" w:themeColor="background1"/>
+                                <w:sz w:val="28"/>
+                                <w:szCs w:val="20"/>
+                              </w:rPr>
+                            </w:pPr>
+                            <w:r>
+                              <w:rPr>
+                                <w:rFonts w:ascii="Quantico" w:hAnsi="Quantico"/>
+                                <w:color w:val="FFFFFF" w:themeColor="background1"/>
+                                <w:sz w:val="28"/>
+                                <w:szCs w:val="20"/>
+                              </w:rPr>
+                              <w:t xml:space="preserve">Feel free to keep </w:t>
+                            </w:r>
+                            <w:r>
+                              <w:rPr>
+                                <w:rFonts w:ascii="Quantico" w:hAnsi="Quantico"/>
+                                <w:color w:val="FFFFFF" w:themeColor="background1"/>
+                                <w:sz w:val="28"/>
+                                <w:szCs w:val="20"/>
+                              </w:rPr>
+                              <w:t>a</w:t>
+                            </w:r>
+                            <w:r>
+                              <w:rPr>
+                                <w:rFonts w:ascii="Quantico" w:hAnsi="Quantico"/>
+                                <w:color w:val="FFFFFF" w:themeColor="background1"/>
+                                <w:sz w:val="28"/>
+                                <w:szCs w:val="20"/>
+                              </w:rPr>
+                              <w:t xml:space="preserve"> plushy</w:t>
+                            </w:r>
+                          </w:p>
+                          <w:p>
+                            <w:pPr>
+                              <w:spacing w:after="0" w:line="240" w:lineRule="auto"/>
+                              <w:jc w:val="center"/>
+                              <w:rPr>
+                                <w:rFonts w:ascii="Quantico" w:hAnsi="Quantico"/>
+                                <w:i/>
+                                <w:iCs/>
+                                <w:color w:val="FFFFFF" w:themeColor="background1"/>
+                                <w:sz w:val="16"/>
+                                <w:szCs w:val="8"/>
+                              </w:rPr>
+                            </w:pPr>
+                            <w:r>
+                              <w:rPr>
+                                <w:rFonts w:ascii="Quantico" w:hAnsi="Quantico"/>
+                                <w:i/>
+                                <w:iCs/>
+                                <w:color w:val="FFFFFF" w:themeColor="background1"/>
+                                <w:sz w:val="16"/>
+                                <w:szCs w:val="8"/>
+                              </w:rPr>
+                              <w:t>(you can add a new one for the next team if you want)</w:t>
+                            </w:r>
+                          </w:p>
+                        </w:txbxContent>
+                      </wps:txbx>
+                      <wps:bodyPr rot="0" vert="horz" wrap="square" lIns="91440" tIns="45720" rIns="91440" bIns="45720" anchor="t" anchorCtr="0">
+                        <a:noAutofit/>
+                      </wps:bodyPr>
+                    </wps:wsp>
+                  </a:graphicData>
+                </a:graphic>
+                <wp14:sizeRelH relativeFrom="margin">
+                  <wp14:pctWidth>0</wp14:pctWidth>
+                </wp14:sizeRelH>
+                <wp14:sizeRelV relativeFrom="margin">
+                  <wp14:pctHeight>0</wp14:pctHeight>
+                </wp14:sizeRelV>
+              </wp:anchor>
+            </w:drawing>
+          </mc:Choice>
+          <mc:Fallback>
+            <w:pict>
+              <v:shape w14:anchorId="711B291C" id="_x0000_s1028" type="#_x0000_t202" style="position:absolute;margin-left:48.45pt;margin-top:193.4pt;width:241.85pt;height:94pt;z-index:251672576;visibility:visible;mso-wrap-style:square;mso-width-percent:0;mso-height-percent:0;mso-wrap-distance-left:9pt;mso-wrap-distance-top:3.6pt;mso-wrap-distance-right:9pt;mso-wrap-distance-bottom:3.6pt;mso-position-horizontal:absolute;mso-position-horizontal-relative:margin;mso-position-vertical:absolute;mso-position-vertical-relative:text;mso-width-percent:0;mso-height-percent:0;mso-width-relative:margin;mso-height-relative:margin;v-text-anchor:top" o:gfxdata="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" filled="f" stroked="f">
+                <v:textbox>
+                  <w:txbxContent>
+                    <w:p>
+                      <w:pPr>
+                        <w:spacing w:after="0" w:line="240" w:lineRule="auto"/>
+                        <w:jc w:val="center"/>
+                        <w:rPr>
+                          <w:rFonts w:ascii="Quantico" w:hAnsi="Quantico"/>
+                          <w:b/>
+                          <w:bCs/>
+                          <w:color w:val="FFFFFF" w:themeColor="background1"/>
+                          <w:sz w:val="54"/>
+                          <w:szCs w:val="144"/>
+                        </w:rPr>
+                      </w:pPr>
+                      <w:r>
+                        <w:rPr>
+                          <w:rFonts w:ascii="Quantico" w:hAnsi="Quantico"/>
+                          <w:b/>
+                          <w:bCs/>
+                          <w:color w:val="FFFFFF" w:themeColor="background1"/>
+                          <w:sz w:val="54"/>
+                          <w:szCs w:val="144"/>
                         </w:rPr>
                         <w:t>Congratulations!</w:t>
+                      </w:r>
+                    </w:p>
+                    <w:p>
+                      <w:pPr>
+                        <w:spacing w:after="0" w:line="240" w:lineRule="auto"/>
+                        <w:jc w:val="center"/>
+                        <w:rPr>
+                          <w:rFonts w:ascii="Quantico" w:hAnsi="Quantico"/>
+                          <w:b/>
+                          <w:bCs/>
+                          <w:color w:val="FFFFFF" w:themeColor="background1"/>
+                          <w:sz w:val="30"/>
+                          <w:szCs w:val="22"/>
+                        </w:rPr>
+                      </w:pPr>
+                      <w:r>
+                        <w:rPr>
+                          <w:rFonts w:ascii="Quantico" w:hAnsi="Quantico"/>
+                          <w:b/>
+                          <w:bCs/>
+                          <w:color w:val="FFFFFF" w:themeColor="background1"/>
+                          <w:sz w:val="30"/>
+                          <w:szCs w:val="22"/>
+                        </w:rPr>
+                        <w:t>You completed the game!</w:t>
+                      </w:r>
+                    </w:p>
+                    <w:p>
+                      <w:pPr>
+                        <w:spacing w:after="0" w:line="240" w:lineRule="auto"/>
+                        <w:jc w:val="center"/>
+                        <w:rPr>
+                          <w:rFonts w:ascii="Quantico" w:hAnsi="Quantico"/>
+                          <w:color w:val="FFFFFF" w:themeColor="background1"/>
+                          <w:sz w:val="28"/>
+                          <w:szCs w:val="20"/>
+                        </w:rPr>
+                      </w:pPr>
+                      <w:r>
+                        <w:rPr>
+                          <w:rFonts w:ascii="Quantico" w:hAnsi="Quantico"/>
+                          <w:color w:val="FFFFFF" w:themeColor="background1"/>
+                          <w:sz w:val="28"/>
+                          <w:szCs w:val="20"/>
+                        </w:rPr>
+                        <w:t xml:space="preserve">Feel free to keep </w:t>
+                      </w:r>
+                      <w:r>
+                        <w:rPr>
+                          <w:rFonts w:ascii="Quantico" w:hAnsi="Quantico"/>
+                          <w:color w:val="FFFFFF" w:themeColor="background1"/>
+                          <w:sz w:val="28"/>
+                          <w:szCs w:val="20"/>
+                        </w:rPr>
+                        <w:t>a</w:t>
+                      </w:r>
+                      <w:r>
+                        <w:rPr>
+                          <w:rFonts w:ascii="Quantico" w:hAnsi="Quantico"/>
+                          <w:color w:val="FFFFFF" w:themeColor="background1"/>
+                          <w:sz w:val="28"/>
+                          <w:szCs w:val="20"/>
+                        </w:rPr>
+                        <w:t xml:space="preserve"> plushy</w:t>
+                      </w:r>
+                    </w:p>
+                    <w:p>
+                      <w:pPr>
+                        <w:spacing w:after="0" w:line="240" w:lineRule="auto"/>
+                        <w:jc w:val="center"/>
+                        <w:rPr>
+                          <w:rFonts w:ascii="Quantico" w:hAnsi="Quantico"/>
+                          <w:i/>
+                          <w:iCs/>
+                          <w:color w:val="FFFFFF" w:themeColor="background1"/>
+                          <w:sz w:val="16"/>
+                          <w:szCs w:val="8"/>
+                        </w:rPr>
+                      </w:pPr>
+                      <w:r>
+                        <w:rPr>
+                          <w:rFonts w:ascii="Quantico" w:hAnsi="Quantico"/>
+                          <w:i/>
+                          <w:iCs/>
+                          <w:color w:val="FFFFFF" w:themeColor="background1"/>
+                          <w:sz w:val="16"/>
+                          <w:szCs w:val="8"/>
+                        </w:rPr>
+                        <w:t>(you can add a new one for the next team if you want)</w:t>
                       </w:r>
                     </w:p>
                   </w:txbxContent>
@@ -493,10 +847,592 @@
         <w:rPr>
           <w:noProof/>
         </w:rPr>
+        <w:drawing>
+          <wp:anchor distT="0" distB="0" distL="114300" distR="114300" simplePos="0" relativeHeight="251677696" behindDoc="0" locked="0" layoutInCell="1" allowOverlap="1" wp14:anchorId="522BC641" wp14:editId="1E9FB8F9">
+            <wp:simplePos x="0" y="0"/>
+            <wp:positionH relativeFrom="column">
+              <wp:posOffset>109472</wp:posOffset>
+            </wp:positionH>
+            <wp:positionV relativeFrom="paragraph">
+              <wp:posOffset>3671187</wp:posOffset>
+            </wp:positionV>
+            <wp:extent cx="900000" cy="900000"/>
+            <wp:effectExtent l="0" t="0" r="0" b="0"/>
+            <wp:wrapNone/>
+            <wp:docPr id="808012529" name="Graphic 1"/>
+            <wp:cNvGraphicFramePr>
+              <a:graphicFrameLocks xmlns:a="http://schemas.openxmlformats.org/drawingml/2006/main" noChangeAspect="1"/>
+            </wp:cNvGraphicFramePr>
+            <a:graphic xmlns:a="http://schemas.openxmlformats.org/drawingml/2006/main">
+              <a:graphicData uri="http://schemas.openxmlformats.org/drawingml/2006/picture">
+                <pic:pic xmlns:pic="http://schemas.openxmlformats.org/drawingml/2006/picture">
+                  <pic:nvPicPr>
+                    <pic:cNvPr id="808012529" name="Graphic 808012529"/>
+                    <pic:cNvPicPr/>
+                  </pic:nvPicPr>
+                  <pic:blipFill>
+                    <a:blip r:embed="rId6">
+                      <a:extLst>
+                        <a:ext uri="{96DAC541-7B7A-43D3-8B79-37D633B846F1}">
+                          <asvg:svgBlip xmlns:asvg="http://schemas.microsoft.com/office/drawing/2016/SVG/main" r:embed="rId7"/>
+                        </a:ext>
+                      </a:extLst>
+                    </a:blip>
+                    <a:stretch>
+                      <a:fillRect/>
+                    </a:stretch>
+                  </pic:blipFill>
+                  <pic:spPr>
+                    <a:xfrm>
+                      <a:off x="0" y="0"/>
+                      <a:ext cx="900000" cy="900000"/>
+                    </a:xfrm>
+                    <a:prstGeom prst="rect">
+                      <a:avLst/>
+                    </a:prstGeom>
+                  </pic:spPr>
+                </pic:pic>
+              </a:graphicData>
+            </a:graphic>
+            <wp14:sizeRelH relativeFrom="page">
+              <wp14:pctWidth>0</wp14:pctWidth>
+            </wp14:sizeRelH>
+            <wp14:sizeRelV relativeFrom="page">
+              <wp14:pctHeight>0</wp14:pctHeight>
+            </wp14:sizeRelV>
+          </wp:anchor>
+        </w:drawing>
+      </w:r>
+      <w:r>
+        <w:rPr>
+          <w:noProof/>
+        </w:rPr>
         <mc:AlternateContent>
           <mc:Choice Requires="wps">
             <w:drawing>
-              <wp:anchor distT="45720" distB="45720" distL="114300" distR="114300" simplePos="0" relativeHeight="251665408" behindDoc="0" locked="0" layoutInCell="1" allowOverlap="1" wp14:anchorId="0300FF86" wp14:editId="6550393F">
+              <wp:anchor distT="45720" distB="45720" distL="114300" distR="114300" simplePos="0" relativeHeight="251679744" behindDoc="0" locked="0" layoutInCell="1" allowOverlap="1" wp14:anchorId="6CD9A184" wp14:editId="4B72B74D">
+                <wp:simplePos x="0" y="0"/>
+                <wp:positionH relativeFrom="margin">
+                  <wp:align>left</wp:align>
+                </wp:positionH>
+                <wp:positionV relativeFrom="paragraph">
+                  <wp:posOffset>4510468</wp:posOffset>
+                </wp:positionV>
+                <wp:extent cx="1114425" cy="316865"/>
+                <wp:effectExtent l="0" t="0" r="0" b="0"/>
+                <wp:wrapSquare wrapText="bothSides"/>
+                <wp:docPr id="1421513850" name="Text Box 2"/>
+                <wp:cNvGraphicFramePr>
+                  <a:graphicFrameLocks xmlns:a="http://schemas.openxmlformats.org/drawingml/2006/main"/>
+                </wp:cNvGraphicFramePr>
+                <a:graphic xmlns:a="http://schemas.openxmlformats.org/drawingml/2006/main">
+                  <a:graphicData uri="http://schemas.microsoft.com/office/word/2010/wordprocessingShape">
+                    <wps:wsp>
+                      <wps:cNvSpPr txBox="1">
+                        <a:spLocks noChangeArrowheads="1"/>
+                      </wps:cNvSpPr>
+                      <wps:spPr bwMode="auto">
+                        <a:xfrm>
+                          <a:off x="0" y="0"/>
+                          <a:ext cx="1114425" cy="316865"/>
+                        </a:xfrm>
+                        <a:prstGeom prst="rect">
+                          <a:avLst/>
+                        </a:prstGeom>
+                        <a:noFill/>
+                        <a:ln w="9525">
+                          <a:noFill/>
+                          <a:miter lim="800000"/>
+                          <a:headEnd/>
+                          <a:tailEnd/>
+                        </a:ln>
+                      </wps:spPr>
+                      <wps:txbx>
+                        <w:txbxContent>
+                          <w:p>
+                            <w:pPr>
+                              <w:spacing w:after="0"/>
+                              <w:jc w:val="center"/>
+                              <w:rPr>
+                                <w:rFonts w:ascii="Quantico" w:hAnsi="Quantico"/>
+                                <w:b/>
+                                <w:bCs/>
+                                <w:color w:val="FFFFFF" w:themeColor="background1"/>
+                                <w:szCs w:val="16"/>
+                              </w:rPr>
+                            </w:pPr>
+                            <w:r>
+                              <w:rPr>
+                                <w:rFonts w:ascii="Quantico" w:hAnsi="Quantico"/>
+                                <w:b/>
+                                <w:bCs/>
+                                <w:color w:val="FFFFFF" w:themeColor="background1"/>
+                                <w:szCs w:val="16"/>
+                              </w:rPr>
+                              <w:t>Survey</w:t>
+                            </w:r>
+                          </w:p>
+                        </w:txbxContent>
+                      </wps:txbx>
+                      <wps:bodyPr rot="0" vert="horz" wrap="square" lIns="91440" tIns="45720" rIns="91440" bIns="45720" anchor="t" anchorCtr="0">
+                        <a:noAutofit/>
+                      </wps:bodyPr>
+                    </wps:wsp>
+                  </a:graphicData>
+                </a:graphic>
+                <wp14:sizeRelH relativeFrom="margin">
+                  <wp14:pctWidth>0</wp14:pctWidth>
+                </wp14:sizeRelH>
+                <wp14:sizeRelV relativeFrom="margin">
+                  <wp14:pctHeight>0</wp14:pctHeight>
+                </wp14:sizeRelV>
+              </wp:anchor>
+            </w:drawing>
+          </mc:Choice>
+          <mc:Fallback>
+            <w:pict>
+              <v:shape w14:anchorId="6CD9A184" id="_x0000_s1029" type="#_x0000_t202" style="position:absolute;margin-left:0;margin-top:355.15pt;width:87.75pt;height:24.95pt;z-index:251679744;visibility:visible;mso-wrap-style:square;mso-width-percent:0;mso-height-percent:0;mso-wrap-distance-left:9pt;mso-wrap-distance-top:3.6pt;mso-wrap-distance-right:9pt;mso-wrap-distance-bottom:3.6pt;mso-position-horizontal:left;mso-position-horizontal-relative:margin;mso-position-vertical:absolute;mso-position-vertical-relative:text;mso-width-percent:0;mso-height-percent:0;mso-width-relative:margin;mso-height-relative:margin;v-text-anchor:top" o:gfxdata="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" filled="f" stroked="f">
+                <v:textbox>
+                  <w:txbxContent>
+                    <w:p>
+                      <w:pPr>
+                        <w:spacing w:after="0"/>
+                        <w:jc w:val="center"/>
+                        <w:rPr>
+                          <w:rFonts w:ascii="Quantico" w:hAnsi="Quantico"/>
+                          <w:b/>
+                          <w:bCs/>
+                          <w:color w:val="FFFFFF" w:themeColor="background1"/>
+                          <w:szCs w:val="16"/>
+                        </w:rPr>
+                      </w:pPr>
+                      <w:r>
+                        <w:rPr>
+                          <w:rFonts w:ascii="Quantico" w:hAnsi="Quantico"/>
+                          <w:b/>
+                          <w:bCs/>
+                          <w:color w:val="FFFFFF" w:themeColor="background1"/>
+                          <w:szCs w:val="16"/>
+                        </w:rPr>
+                        <w:t>Survey</w:t>
+                      </w:r>
+                    </w:p>
+                  </w:txbxContent>
+                </v:textbox>
+                <w10:wrap type="square" anchorx="margin"/>
+              </v:shape>
+            </w:pict>
+          </mc:Fallback>
+        </mc:AlternateContent>
+      </w:r>
+      <w:r>
+        <w:drawing>
+          <wp:anchor distT="0" distB="0" distL="114300" distR="114300" simplePos="0" relativeHeight="251680768" behindDoc="0" locked="0" layoutInCell="1" allowOverlap="1" wp14:anchorId="30951398" wp14:editId="321AFDDB">
+            <wp:simplePos x="0" y="0"/>
+            <wp:positionH relativeFrom="margin">
+              <wp:posOffset>3034507</wp:posOffset>
+            </wp:positionH>
+            <wp:positionV relativeFrom="paragraph">
+              <wp:posOffset>3663441</wp:posOffset>
+            </wp:positionV>
+            <wp:extent cx="900000" cy="900000"/>
+            <wp:effectExtent l="0" t="0" r="0" b="0"/>
+            <wp:wrapNone/>
+            <wp:docPr id="783424764" name="Picture 12"/>
+            <wp:cNvGraphicFramePr>
+              <a:graphicFrameLocks xmlns:a="http://schemas.openxmlformats.org/drawingml/2006/main" noChangeAspect="1"/>
+            </wp:cNvGraphicFramePr>
+            <a:graphic xmlns:a="http://schemas.openxmlformats.org/drawingml/2006/main">
+              <a:graphicData uri="http://schemas.openxmlformats.org/drawingml/2006/picture">
+                <pic:pic xmlns:pic="http://schemas.openxmlformats.org/drawingml/2006/picture">
+                  <pic:nvPicPr>
+                    <pic:cNvPr id="0" name="Picture 6"/>
+                    <pic:cNvPicPr>
+                      <a:picLocks noChangeAspect="1" noChangeArrowheads="1"/>
+                    </pic:cNvPicPr>
+                  </pic:nvPicPr>
+                  <pic:blipFill>
+                    <a:blip r:embed="rId8" cstate="print">
+                      <a:extLst>
+                        <a:ext uri="{28A0092B-C50C-407E-A947-70E740481C1C}">
+                          <a14:useLocalDpi xmlns:a14="http://schemas.microsoft.com/office/drawing/2010/main" val="0"/>
+                        </a:ext>
+                      </a:extLst>
+                    </a:blip>
+                    <a:srcRect/>
+                    <a:stretch>
+                      <a:fillRect/>
+                    </a:stretch>
+                  </pic:blipFill>
+                  <pic:spPr bwMode="auto">
+                    <a:xfrm>
+                      <a:off x="0" y="0"/>
+                      <a:ext cx="900000" cy="900000"/>
+                    </a:xfrm>
+                    <a:prstGeom prst="rect">
+                      <a:avLst/>
+                    </a:prstGeom>
+                    <a:noFill/>
+                    <a:ln>
+                      <a:noFill/>
+                    </a:ln>
+                  </pic:spPr>
+                </pic:pic>
+              </a:graphicData>
+            </a:graphic>
+            <wp14:sizeRelH relativeFrom="page">
+              <wp14:pctWidth>0</wp14:pctWidth>
+            </wp14:sizeRelH>
+            <wp14:sizeRelV relativeFrom="page">
+              <wp14:pctHeight>0</wp14:pctHeight>
+            </wp14:sizeRelV>
+          </wp:anchor>
+        </w:drawing>
+      </w:r>
+      <w:r>
+        <w:rPr>
+          <w:noProof/>
+        </w:rPr>
+        <mc:AlternateContent>
+          <mc:Choice Requires="wps">
+            <w:drawing>
+              <wp:anchor distT="45720" distB="45720" distL="114300" distR="114300" simplePos="0" relativeHeight="251682816" behindDoc="0" locked="0" layoutInCell="1" allowOverlap="1" wp14:anchorId="7AC43787" wp14:editId="0A9276BB">
+                <wp:simplePos x="0" y="0"/>
+                <wp:positionH relativeFrom="page">
+                  <wp:posOffset>3544008</wp:posOffset>
+                </wp:positionH>
+                <wp:positionV relativeFrom="paragraph">
+                  <wp:posOffset>4511675</wp:posOffset>
+                </wp:positionV>
+                <wp:extent cx="1722755" cy="316865"/>
+                <wp:effectExtent l="0" t="0" r="0" b="0"/>
+                <wp:wrapSquare wrapText="bothSides"/>
+                <wp:docPr id="52223908" name="Text Box 2"/>
+                <wp:cNvGraphicFramePr>
+                  <a:graphicFrameLocks xmlns:a="http://schemas.openxmlformats.org/drawingml/2006/main"/>
+                </wp:cNvGraphicFramePr>
+                <a:graphic xmlns:a="http://schemas.openxmlformats.org/drawingml/2006/main">
+                  <a:graphicData uri="http://schemas.microsoft.com/office/word/2010/wordprocessingShape">
+                    <wps:wsp>
+                      <wps:cNvSpPr txBox="1">
+                        <a:spLocks noChangeArrowheads="1"/>
+                      </wps:cNvSpPr>
+                      <wps:spPr bwMode="auto">
+                        <a:xfrm>
+                          <a:off x="0" y="0"/>
+                          <a:ext cx="1722755" cy="316865"/>
+                        </a:xfrm>
+                        <a:prstGeom prst="rect">
+                          <a:avLst/>
+                        </a:prstGeom>
+                        <a:noFill/>
+                        <a:ln w="9525">
+                          <a:noFill/>
+                          <a:miter lim="800000"/>
+                          <a:headEnd/>
+                          <a:tailEnd/>
+                        </a:ln>
+                      </wps:spPr>
+                      <wps:txbx>
+                        <w:txbxContent>
+                          <w:p>
+                            <w:pPr>
+                              <w:spacing w:after="0"/>
+                              <w:jc w:val="center"/>
+                              <w:rPr>
+                                <w:rFonts w:ascii="Quantico" w:hAnsi="Quantico"/>
+                                <w:b/>
+                                <w:bCs/>
+                                <w:color w:val="FFFFFF" w:themeColor="background1"/>
+                                <w:szCs w:val="16"/>
+                              </w:rPr>
+                            </w:pPr>
+                            <w:r>
+                              <w:rPr>
+                                <w:rFonts w:ascii="Quantico" w:hAnsi="Quantico"/>
+                                <w:b/>
+                                <w:bCs/>
+                                <w:color w:val="FFFFFF" w:themeColor="background1"/>
+                                <w:szCs w:val="16"/>
+                              </w:rPr>
+                              <w:t>Reset instructions</w:t>
+                            </w:r>
+                          </w:p>
+                        </w:txbxContent>
+                      </wps:txbx>
+                      <wps:bodyPr rot="0" vert="horz" wrap="square" lIns="91440" tIns="45720" rIns="91440" bIns="45720" anchor="t" anchorCtr="0">
+                        <a:noAutofit/>
+                      </wps:bodyPr>
+                    </wps:wsp>
+                  </a:graphicData>
+                </a:graphic>
+                <wp14:sizeRelH relativeFrom="margin">
+                  <wp14:pctWidth>0</wp14:pctWidth>
+                </wp14:sizeRelH>
+                <wp14:sizeRelV relativeFrom="margin">
+                  <wp14:pctHeight>0</wp14:pctHeight>
+                </wp14:sizeRelV>
+              </wp:anchor>
+            </w:drawing>
+          </mc:Choice>
+          <mc:Fallback>
+            <w:pict>
+              <v:shape w14:anchorId="7AC43787" id="_x0000_s1030" type="#_x0000_t202" style="position:absolute;margin-left:279.05pt;margin-top:355.25pt;width:135.65pt;height:24.95pt;z-index:251682816;visibility:visible;mso-wrap-style:square;mso-width-percent:0;mso-height-percent:0;mso-wrap-distance-left:9pt;mso-wrap-distance-top:3.6pt;mso-wrap-distance-right:9pt;mso-wrap-distance-bottom:3.6pt;mso-position-horizontal:absolute;mso-position-horizontal-relative:page;mso-position-vertical:absolute;mso-position-vertical-relative:text;mso-width-percent:0;mso-height-percent:0;mso-width-relative:margin;mso-height-relative:margin;v-text-anchor:top" o:gfxdata="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" filled="f" stroked="f">
+                <v:textbox>
+                  <w:txbxContent>
+                    <w:p>
+                      <w:pPr>
+                        <w:spacing w:after="0"/>
+                        <w:jc w:val="center"/>
+                        <w:rPr>
+                          <w:rFonts w:ascii="Quantico" w:hAnsi="Quantico"/>
+                          <w:b/>
+                          <w:bCs/>
+                          <w:color w:val="FFFFFF" w:themeColor="background1"/>
+                          <w:szCs w:val="16"/>
+                        </w:rPr>
+                      </w:pPr>
+                      <w:r>
+                        <w:rPr>
+                          <w:rFonts w:ascii="Quantico" w:hAnsi="Quantico"/>
+                          <w:b/>
+                          <w:bCs/>
+                          <w:color w:val="FFFFFF" w:themeColor="background1"/>
+                          <w:szCs w:val="16"/>
+                        </w:rPr>
+                        <w:t>Reset instructions</w:t>
+                      </w:r>
+                    </w:p>
+                  </w:txbxContent>
+                </v:textbox>
+                <w10:wrap type="square" anchorx="page"/>
+              </v:shape>
+            </w:pict>
+          </mc:Fallback>
+        </mc:AlternateContent>
+      </w:r>
+      <w:r>
+        <w:rPr>
+          <w:noProof/>
+        </w:rPr>
+        <mc:AlternateContent>
+          <mc:Choice Requires="wps">
+            <w:drawing>
+              <wp:anchor distT="0" distB="0" distL="114300" distR="114300" simplePos="0" relativeHeight="251670528" behindDoc="0" locked="0" layoutInCell="1" allowOverlap="1" wp14:anchorId="10C35BE6" wp14:editId="197EEA3B">
+                <wp:simplePos x="0" y="0"/>
+                <wp:positionH relativeFrom="column">
+                  <wp:posOffset>895507</wp:posOffset>
+                </wp:positionH>
+                <wp:positionV relativeFrom="paragraph">
+                  <wp:posOffset>2501375</wp:posOffset>
+                </wp:positionV>
+                <wp:extent cx="2489493" cy="1076876"/>
+                <wp:effectExtent l="0" t="0" r="6350" b="9525"/>
+                <wp:wrapNone/>
+                <wp:docPr id="1911675260" name="Rectangle: Rounded Corners 4"/>
+                <wp:cNvGraphicFramePr/>
+                <a:graphic xmlns:a="http://schemas.openxmlformats.org/drawingml/2006/main">
+                  <a:graphicData uri="http://schemas.microsoft.com/office/word/2010/wordprocessingShape">
+                    <wps:wsp>
+                      <wps:cNvSpPr/>
+                      <wps:spPr>
+                        <a:xfrm>
+                          <a:off x="0" y="0"/>
+                          <a:ext cx="2489493" cy="1076876"/>
+                        </a:xfrm>
+                        <a:prstGeom prst="roundRect">
+                          <a:avLst/>
+                        </a:prstGeom>
+                        <a:solidFill>
+                          <a:srgbClr val="0E2841">
+                            <a:alpha val="85098"/>
+                          </a:srgbClr>
+                        </a:solidFill>
+                        <a:ln>
+                          <a:noFill/>
+                        </a:ln>
+                      </wps:spPr>
+                      <wps:style>
+                        <a:lnRef idx="2">
+                          <a:schemeClr val="accent1">
+                            <a:shade val="15000"/>
+                          </a:schemeClr>
+                        </a:lnRef>
+                        <a:fillRef idx="1">
+                          <a:schemeClr val="accent1"/>
+                        </a:fillRef>
+                        <a:effectRef idx="0">
+                          <a:schemeClr val="accent1"/>
+                        </a:effectRef>
+                        <a:fontRef idx="minor">
+                          <a:schemeClr val="lt1"/>
+                        </a:fontRef>
+                      </wps:style>
+                      <wps:bodyPr rot="0" spcFirstLastPara="0" vertOverflow="overflow" horzOverflow="overflow" vert="horz" wrap="square" lIns="91440" tIns="45720" rIns="91440" bIns="45720" numCol="1" spcCol="0" rtlCol="0" fromWordArt="0" anchor="ctr" anchorCtr="0" forceAA="0" compatLnSpc="1">
+                        <a:prstTxWarp prst="textNoShape">
+                          <a:avLst/>
+                        </a:prstTxWarp>
+                        <a:noAutofit/>
+                      </wps:bodyPr>
+                    </wps:wsp>
+                  </a:graphicData>
+                </a:graphic>
+                <wp14:sizeRelH relativeFrom="margin">
+                  <wp14:pctWidth>0</wp14:pctWidth>
+                </wp14:sizeRelH>
+                <wp14:sizeRelV relativeFrom="margin">
+                  <wp14:pctHeight>0</wp14:pctHeight>
+                </wp14:sizeRelV>
+              </wp:anchor>
+            </w:drawing>
+          </mc:Choice>
+          <mc:Fallback>
+            <w:pict>
+              <v:roundrect w14:anchorId="77B24340" id="Rectangle: Rounded Corners 4" o:spid="_x0000_s1026" style="position:absolute;margin-left:70.5pt;margin-top:196.95pt;width:196pt;height:84.8pt;z-index:251670528;visibility:visible;mso-wrap-style:square;mso-width-percent:0;mso-height-percent:0;mso-wrap-distance-left:9pt;mso-wrap-distance-top:0;mso-wrap-distance-right:9pt;mso-wrap-distance-bottom:0;mso-position-horizontal:absolute;mso-position-horizontal-relative:text;mso-position-vertical:absolute;mso-position-vertical-relative:text;mso-width-percent:0;mso-height-percent:0;mso-width-relative:margin;mso-height-relative:margin;v-text-anchor:middle" arcsize="10923f" o:gfxdata="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" fillcolor="#0e2841" stroked="f" strokeweight="1.5pt">
+                <v:fill opacity="55769f"/>
+                <v:stroke joinstyle="miter"/>
+              </v:roundrect>
+            </w:pict>
+          </mc:Fallback>
+        </mc:AlternateContent>
+      </w:r>
+      <w:r>
+        <w:rPr>
+          <w:noProof/>
+        </w:rPr>
+        <w:drawing>
+          <wp:anchor distT="0" distB="0" distL="114300" distR="114300" simplePos="0" relativeHeight="251669504" behindDoc="0" locked="0" layoutInCell="1" allowOverlap="1" wp14:anchorId="05480DD2" wp14:editId="20DA1953">
+            <wp:simplePos x="0" y="0"/>
+            <wp:positionH relativeFrom="column">
+              <wp:posOffset>3644275</wp:posOffset>
+            </wp:positionH>
+            <wp:positionV relativeFrom="paragraph">
+              <wp:posOffset>2430554</wp:posOffset>
+            </wp:positionV>
+            <wp:extent cx="398780" cy="398780"/>
+            <wp:effectExtent l="0" t="0" r="0" b="1270"/>
+            <wp:wrapNone/>
+            <wp:docPr id="841224834" name="Graphic 2" descr="Confetti ball with solid fill"/>
+            <wp:cNvGraphicFramePr>
+              <a:graphicFrameLocks xmlns:a="http://schemas.openxmlformats.org/drawingml/2006/main" noChangeAspect="1"/>
+            </wp:cNvGraphicFramePr>
+            <a:graphic xmlns:a="http://schemas.openxmlformats.org/drawingml/2006/main">
+              <a:graphicData uri="http://schemas.openxmlformats.org/drawingml/2006/picture">
+                <pic:pic xmlns:pic="http://schemas.openxmlformats.org/drawingml/2006/picture">
+                  <pic:nvPicPr>
+                    <pic:cNvPr id="764364432" name="Graphic 764364432" descr="Confetti ball with solid fill"/>
+                    <pic:cNvPicPr/>
+                  </pic:nvPicPr>
+                  <pic:blipFill>
+                    <a:blip r:embed="rId9">
+                      <a:extLst>
+                        <a:ext uri="{96DAC541-7B7A-43D3-8B79-37D633B846F1}">
+                          <asvg:svgBlip xmlns:asvg="http://schemas.microsoft.com/office/drawing/2016/SVG/main" r:embed="rId10"/>
+                        </a:ext>
+                      </a:extLst>
+                    </a:blip>
+                    <a:stretch>
+                      <a:fillRect/>
+                    </a:stretch>
+                  </pic:blipFill>
+                  <pic:spPr>
+                    <a:xfrm>
+                      <a:off x="0" y="0"/>
+                      <a:ext cx="398780" cy="398780"/>
+                    </a:xfrm>
+                    <a:prstGeom prst="rect">
+                      <a:avLst/>
+                    </a:prstGeom>
+                  </pic:spPr>
+                </pic:pic>
+              </a:graphicData>
+            </a:graphic>
+            <wp14:sizeRelH relativeFrom="page">
+              <wp14:pctWidth>0</wp14:pctWidth>
+            </wp14:sizeRelH>
+            <wp14:sizeRelV relativeFrom="page">
+              <wp14:pctHeight>0</wp14:pctHeight>
+            </wp14:sizeRelV>
+          </wp:anchor>
+        </w:drawing>
+      </w:r>
+      <w:r>
+        <w:rPr>
+          <w:noProof/>
+        </w:rPr>
+        <w:drawing>
+          <wp:anchor distT="0" distB="0" distL="114300" distR="114300" simplePos="0" relativeHeight="251667456" behindDoc="0" locked="0" layoutInCell="1" allowOverlap="1" wp14:anchorId="44FD9E5A" wp14:editId="0A3965E9">
+            <wp:simplePos x="0" y="0"/>
+            <wp:positionH relativeFrom="margin">
+              <wp:align>left</wp:align>
+            </wp:positionH>
+            <wp:positionV relativeFrom="paragraph">
+              <wp:posOffset>2318918</wp:posOffset>
+            </wp:positionV>
+            <wp:extent cx="4112921" cy="2520000"/>
+            <wp:effectExtent l="0" t="0" r="1905" b="0"/>
+            <wp:wrapNone/>
+            <wp:docPr id="1276372622" name="Picture 9"/>
+            <wp:cNvGraphicFramePr>
+              <a:graphicFrameLocks xmlns:a="http://schemas.openxmlformats.org/drawingml/2006/main" noChangeAspect="1"/>
+            </wp:cNvGraphicFramePr>
+            <a:graphic xmlns:a="http://schemas.openxmlformats.org/drawingml/2006/main">
+              <a:graphicData uri="http://schemas.openxmlformats.org/drawingml/2006/picture">
+                <pic:pic xmlns:pic="http://schemas.openxmlformats.org/drawingml/2006/picture">
+                  <pic:nvPicPr>
+                    <pic:cNvPr id="1582992251" name="Picture 1582992251"/>
+                    <pic:cNvPicPr/>
+                  </pic:nvPicPr>
+                  <pic:blipFill rotWithShape="1">
+                    <a:blip r:embed="rId11" cstate="print">
+                      <a:extLst>
+                        <a:ext uri="{28A0092B-C50C-407E-A947-70E740481C1C}">
+                          <a14:useLocalDpi xmlns:a14="http://schemas.microsoft.com/office/drawing/2010/main" val="0"/>
+                        </a:ext>
+                      </a:extLst>
+                    </a:blip>
+                    <a:srcRect b="8101"/>
+                    <a:stretch>
+                      <a:fillRect/>
+                    </a:stretch>
+                  </pic:blipFill>
+                  <pic:spPr bwMode="auto">
+                    <a:xfrm>
+                      <a:off x="0" y="0"/>
+                      <a:ext cx="4112921" cy="2520000"/>
+                    </a:xfrm>
+                    <a:prstGeom prst="rect">
+                      <a:avLst/>
+                    </a:prstGeom>
+                    <a:ln>
+                      <a:noFill/>
+                    </a:ln>
+                    <a:extLst>
+                      <a:ext uri="{53640926-AAD7-44D8-BBD7-CCE9431645EC}">
+                        <a14:shadowObscured xmlns:a14="http://schemas.microsoft.com/office/drawing/2010/main"/>
+                      </a:ext>
+                    </a:extLst>
+                  </pic:spPr>
+                </pic:pic>
+              </a:graphicData>
+            </a:graphic>
+            <wp14:sizeRelH relativeFrom="page">
+              <wp14:pctWidth>0</wp14:pctWidth>
+            </wp14:sizeRelH>
+            <wp14:sizeRelV relativeFrom="page">
+              <wp14:pctHeight>0</wp14:pctHeight>
+            </wp14:sizeRelV>
+          </wp:anchor>
+        </w:drawing>
+      </w:r>
+      <w:r>
+        <w:rPr>
+          <w:noProof/>
+        </w:rPr>
+        <mc:AlternateContent>
+          <mc:Choice Requires="wps">
+            <w:drawing>
+              <wp:anchor distT="45720" distB="45720" distL="114300" distR="114300" simplePos="0" relativeHeight="251665408" behindDoc="0" locked="0" layoutInCell="1" allowOverlap="1" wp14:anchorId="0300FF86" wp14:editId="54DBAB46">
                 <wp:simplePos x="0" y="0"/>
                 <wp:positionH relativeFrom="margin">
                   <wp:posOffset>857402</wp:posOffset>
@@ -625,7 +1561,7 @@
           </mc:Choice>
           <mc:Fallback>
             <w:pict>
-              <v:shape w14:anchorId="0300FF86" id="_x0000_s1029" type="#_x0000_t202" style="position:absolute;margin-left:67.5pt;margin-top:105.35pt;width:227.7pt;height:60.7pt;z-index:251665408;visibility:visible;mso-wrap-style:square;mso-width-percent:0;mso-height-percent:0;mso-wrap-distance-left:9pt;mso-wrap-distance-top:3.6pt;mso-wrap-distance-right:9pt;mso-wrap-distance-bottom:3.6pt;mso-position-horizontal:absolute;mso-position-horizontal-relative:margin;mso-position-vertical:absolute;mso-position-vertical-relative:text;mso-width-percent:0;mso-height-percent:0;mso-width-relative:margin;mso-height-relative:margin;v-text-anchor:top" o:gfxdata="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" filled="f" stroked="f">
+              <v:shape w14:anchorId="0300FF86" id="_x0000_s1031" type="#_x0000_t202" style="position:absolute;margin-left:67.5pt;margin-top:105.35pt;width:227.7pt;height:60.7pt;z-index:251665408;visibility:visible;mso-wrap-style:square;mso-width-percent:0;mso-height-percent:0;mso-wrap-distance-left:9pt;mso-wrap-distance-top:3.6pt;mso-wrap-distance-right:9pt;mso-wrap-distance-bottom:3.6pt;mso-position-horizontal:absolute;mso-position-horizontal-relative:margin;mso-position-vertical:absolute;mso-position-vertical-relative:text;mso-width-percent:0;mso-height-percent:0;mso-width-relative:margin;mso-height-relative:margin;v-text-anchor:top" o:gfxdata="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" filled="f" stroked="f">
                 <v:textbox>
                   <w:txbxContent>
                     <w:p>
@@ -886,7 +1822,7 @@
           </mc:Choice>
           <mc:Fallback>
             <w:pict>
-              <v:shape w14:anchorId="4E2A98A6" id="_x0000_s1030" type="#_x0000_t202" style="position:absolute;margin-left:92.7pt;margin-top:54.9pt;width:177.95pt;height:58.5pt;z-index:251663360;visibility:visible;mso-wrap-style:square;mso-width-percent:0;mso-height-percent:0;mso-wrap-distance-left:9pt;mso-wrap-distance-top:3.6pt;mso-wrap-distance-right:9pt;mso-wrap-distance-bottom:3.6pt;mso-position-horizontal:absolute;mso-position-horizontal-relative:margin;mso-position-vertical:absolute;mso-position-vertical-relative:text;mso-width-percent:0;mso-height-percent:0;mso-width-relative:margin;mso-height-relative:margin;v-text-anchor:middle" o:gfxdata="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" filled="f" stroked="f">
+              <v:shape w14:anchorId="4E2A98A6" id="_x0000_s1032" type="#_x0000_t202" style="position:absolute;margin-left:92.7pt;margin-top:54.9pt;width:177.95pt;height:58.5pt;z-index:251663360;visibility:visible;mso-wrap-style:square;mso-width-percent:0;mso-height-percent:0;mso-wrap-distance-left:9pt;mso-wrap-distance-top:3.6pt;mso-wrap-distance-right:9pt;mso-wrap-distance-bottom:3.6pt;mso-position-horizontal:absolute;mso-position-horizontal-relative:margin;mso-position-vertical:absolute;mso-position-vertical-relative:text;mso-width-percent:0;mso-height-percent:0;mso-width-relative:margin;mso-height-relative:margin;v-text-anchor:middle" o:gfxdata="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" filled="f" stroked="f">
                 <v:textbox>
                   <w:txbxContent>
                     <w:p>
@@ -1041,7 +1977,7 @@
           </mc:Choice>
           <mc:Fallback>
             <w:pict>
-              <v:shape w14:anchorId="5E8DA363" id="_x0000_s1031" type="#_x0000_t202" style="position:absolute;margin-left:55.1pt;margin-top:17.8pt;width:223.45pt;height:50.2pt;z-index:251661312;visibility:visible;mso-wrap-style:square;mso-width-percent:0;mso-height-percent:0;mso-wrap-distance-left:9pt;mso-wrap-distance-top:3.6pt;mso-wrap-distance-right:9pt;mso-wrap-distance-bottom:3.6pt;mso-position-horizontal:absolute;mso-position-horizontal-relative:margin;mso-position-vertical:absolute;mso-position-vertical-relative:text;mso-width-percent:0;mso-height-percent:0;mso-width-relative:margin;mso-height-relative:margin;v-text-anchor:middle" o:gfxdata="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" filled="f" stroked="f">
+              <v:shape w14:anchorId="5E8DA363" id="_x0000_s1033" type="#_x0000_t202" style="position:absolute;margin-left:55.1pt;margin-top:17.8pt;width:223.45pt;height:50.2pt;z-index:251661312;visibility:visible;mso-wrap-style:square;mso-width-percent:0;mso-height-percent:0;mso-wrap-distance-left:9pt;mso-wrap-distance-top:3.6pt;mso-wrap-distance-right:9pt;mso-wrap-distance-bottom:3.6pt;mso-position-horizontal:absolute;mso-position-horizontal-relative:margin;mso-position-vertical:absolute;mso-position-vertical-relative:text;mso-width-percent:0;mso-height-percent:0;mso-width-relative:margin;mso-height-relative:margin;v-text-anchor:middle" o:gfxdata="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" filled="f" stroked="f">
                 <v:textbox>
                   <w:txbxContent>
                     <w:p>
@@ -1130,7 +2066,7 @@
                     <pic:cNvPicPr/>
                   </pic:nvPicPr>
                   <pic:blipFill rotWithShape="1">
-                    <a:blip r:embed="rId4" cstate="print">
+                    <a:blip r:embed="rId11" cstate="print">
                       <a:extLst>
                         <a:ext uri="{28A0092B-C50C-407E-A947-70E740481C1C}">
                           <a14:useLocalDpi xmlns:a14="http://schemas.microsoft.com/office/drawing/2010/main" val="0"/>
@@ -1199,7 +2135,7 @@
                     <pic:cNvPicPr/>
                   </pic:nvPicPr>
                   <pic:blipFill>
-                    <a:blip r:embed="rId5" cstate="print">
+                    <a:blip r:embed="rId12" cstate="print">
                       <a:biLevel thresh="25000"/>
                       <a:extLst>
                         <a:ext uri="{28A0092B-C50C-407E-A947-70E740481C1C}">
@@ -1322,7 +2258,7 @@
           <w:noProof/>
         </w:rPr>
         <w:drawing>
-          <wp:anchor distT="0" distB="0" distL="114300" distR="114300" simplePos="0" relativeHeight="251666432" behindDoc="0" locked="0" layoutInCell="1" allowOverlap="1" wp14:anchorId="2EA23918" wp14:editId="20750997">
+          <wp:anchor distT="0" distB="0" distL="114300" distR="114300" simplePos="0" relativeHeight="251666432" behindDoc="0" locked="0" layoutInCell="1" allowOverlap="1" wp14:anchorId="2EA23918" wp14:editId="45866725">
             <wp:simplePos x="0" y="0"/>
             <wp:positionH relativeFrom="margin">
               <wp:posOffset>1208405</wp:posOffset>
@@ -1345,10 +2281,10 @@
                     <pic:cNvPicPr/>
                   </pic:nvPicPr>
                   <pic:blipFill>
-                    <a:blip r:embed="rId6">
+                    <a:blip r:embed="rId13">
                       <a:extLst>
                         <a:ext uri="{96DAC541-7B7A-43D3-8B79-37D633B846F1}">
-                          <asvg:svgBlip xmlns:asvg="http://schemas.microsoft.com/office/drawing/2016/SVG/main" r:embed="rId7"/>
+                          <asvg:svgBlip xmlns:asvg="http://schemas.microsoft.com/office/drawing/2016/SVG/main" r:embed="rId14"/>
                         </a:ext>
                       </a:extLst>
                     </a:blip>
@@ -1382,76 +2318,7 @@
           <w:noProof/>
         </w:rPr>
         <w:drawing>
-          <wp:anchor distT="0" distB="0" distL="114300" distR="114300" simplePos="0" relativeHeight="251667456" behindDoc="0" locked="0" layoutInCell="1" allowOverlap="1" wp14:anchorId="44FD9E5A" wp14:editId="50B0BAE3">
-            <wp:simplePos x="0" y="0"/>
-            <wp:positionH relativeFrom="margin">
-              <wp:posOffset>0</wp:posOffset>
-            </wp:positionH>
-            <wp:positionV relativeFrom="paragraph">
-              <wp:posOffset>2319020</wp:posOffset>
-            </wp:positionV>
-            <wp:extent cx="3525361" cy="2160000"/>
-            <wp:effectExtent l="0" t="0" r="0" b="0"/>
-            <wp:wrapNone/>
-            <wp:docPr id="1276372622" name="Picture 9"/>
-            <wp:cNvGraphicFramePr>
-              <a:graphicFrameLocks xmlns:a="http://schemas.openxmlformats.org/drawingml/2006/main" noChangeAspect="1"/>
-            </wp:cNvGraphicFramePr>
-            <a:graphic xmlns:a="http://schemas.openxmlformats.org/drawingml/2006/main">
-              <a:graphicData uri="http://schemas.openxmlformats.org/drawingml/2006/picture">
-                <pic:pic xmlns:pic="http://schemas.openxmlformats.org/drawingml/2006/picture">
-                  <pic:nvPicPr>
-                    <pic:cNvPr id="1582992251" name="Picture 1582992251"/>
-                    <pic:cNvPicPr/>
-                  </pic:nvPicPr>
-                  <pic:blipFill rotWithShape="1">
-                    <a:blip r:embed="rId4" cstate="print">
-                      <a:extLst>
-                        <a:ext uri="{28A0092B-C50C-407E-A947-70E740481C1C}">
-                          <a14:useLocalDpi xmlns:a14="http://schemas.microsoft.com/office/drawing/2010/main" val="0"/>
-                        </a:ext>
-                      </a:extLst>
-                    </a:blip>
-                    <a:srcRect b="8101"/>
-                    <a:stretch>
-                      <a:fillRect/>
-                    </a:stretch>
-                  </pic:blipFill>
-                  <pic:spPr bwMode="auto">
-                    <a:xfrm>
-                      <a:off x="0" y="0"/>
-                      <a:ext cx="3525361" cy="2160000"/>
-                    </a:xfrm>
-                    <a:prstGeom prst="rect">
-                      <a:avLst/>
-                    </a:prstGeom>
-                    <a:ln>
-                      <a:noFill/>
-                    </a:ln>
-                    <a:extLst>
-                      <a:ext uri="{53640926-AAD7-44D8-BBD7-CCE9431645EC}">
-                        <a14:shadowObscured xmlns:a14="http://schemas.microsoft.com/office/drawing/2010/main"/>
-                      </a:ext>
-                    </a:extLst>
-                  </pic:spPr>
-                </pic:pic>
-              </a:graphicData>
-            </a:graphic>
-            <wp14:sizeRelH relativeFrom="page">
-              <wp14:pctWidth>0</wp14:pctWidth>
-            </wp14:sizeRelH>
-            <wp14:sizeRelV relativeFrom="page">
-              <wp14:pctHeight>0</wp14:pctHeight>
-            </wp14:sizeRelV>
-          </wp:anchor>
-        </w:drawing>
-      </w:r>
-      <w:r>
-        <w:rPr>
-          <w:noProof/>
-        </w:rPr>
-        <w:drawing>
-          <wp:anchor distT="0" distB="0" distL="114300" distR="114300" simplePos="0" relativeHeight="251668480" behindDoc="0" locked="0" layoutInCell="1" allowOverlap="1" wp14:anchorId="26FE684A" wp14:editId="08F39FD9">
+          <wp:anchor distT="0" distB="0" distL="114300" distR="114300" simplePos="0" relativeHeight="251668480" behindDoc="0" locked="0" layoutInCell="1" allowOverlap="1" wp14:anchorId="26FE684A" wp14:editId="0CD56BDA">
             <wp:simplePos x="0" y="0"/>
             <wp:positionH relativeFrom="column">
               <wp:posOffset>10160</wp:posOffset>
@@ -1474,10 +2341,10 @@
                     <pic:cNvPicPr/>
                   </pic:nvPicPr>
                   <pic:blipFill>
-                    <a:blip r:embed="rId8">
+                    <a:blip r:embed="rId15">
                       <a:extLst>
                         <a:ext uri="{96DAC541-7B7A-43D3-8B79-37D633B846F1}">
-                          <asvg:svgBlip xmlns:asvg="http://schemas.microsoft.com/office/drawing/2016/SVG/main" r:embed="rId9"/>
+                          <asvg:svgBlip xmlns:asvg="http://schemas.microsoft.com/office/drawing/2016/SVG/main" r:embed="rId16"/>
                         </a:ext>
                       </a:extLst>
                     </a:blip>
@@ -1511,297 +2378,7 @@
           <w:noProof/>
         </w:rPr>
         <w:drawing>
-          <wp:anchor distT="0" distB="0" distL="114300" distR="114300" simplePos="0" relativeHeight="251669504" behindDoc="0" locked="0" layoutInCell="1" allowOverlap="1" wp14:anchorId="05480DD2" wp14:editId="3846D76E">
-            <wp:simplePos x="0" y="0"/>
-            <wp:positionH relativeFrom="column">
-              <wp:posOffset>3041015</wp:posOffset>
-            </wp:positionH>
-            <wp:positionV relativeFrom="paragraph">
-              <wp:posOffset>2378075</wp:posOffset>
-            </wp:positionV>
-            <wp:extent cx="398780" cy="398780"/>
-            <wp:effectExtent l="0" t="0" r="0" b="1270"/>
-            <wp:wrapNone/>
-            <wp:docPr id="841224834" name="Graphic 2" descr="Confetti ball with solid fill"/>
-            <wp:cNvGraphicFramePr>
-              <a:graphicFrameLocks xmlns:a="http://schemas.openxmlformats.org/drawingml/2006/main" noChangeAspect="1"/>
-            </wp:cNvGraphicFramePr>
-            <a:graphic xmlns:a="http://schemas.openxmlformats.org/drawingml/2006/main">
-              <a:graphicData uri="http://schemas.openxmlformats.org/drawingml/2006/picture">
-                <pic:pic xmlns:pic="http://schemas.openxmlformats.org/drawingml/2006/picture">
-                  <pic:nvPicPr>
-                    <pic:cNvPr id="764364432" name="Graphic 764364432" descr="Confetti ball with solid fill"/>
-                    <pic:cNvPicPr/>
-                  </pic:nvPicPr>
-                  <pic:blipFill>
-                    <a:blip r:embed="rId10">
-                      <a:extLst>
-                        <a:ext uri="{96DAC541-7B7A-43D3-8B79-37D633B846F1}">
-                          <asvg:svgBlip xmlns:asvg="http://schemas.microsoft.com/office/drawing/2016/SVG/main" r:embed="rId11"/>
-                        </a:ext>
-                      </a:extLst>
-                    </a:blip>
-                    <a:stretch>
-                      <a:fillRect/>
-                    </a:stretch>
-                  </pic:blipFill>
-                  <pic:spPr>
-                    <a:xfrm>
-                      <a:off x="0" y="0"/>
-                      <a:ext cx="398780" cy="398780"/>
-                    </a:xfrm>
-                    <a:prstGeom prst="rect">
-                      <a:avLst/>
-                    </a:prstGeom>
-                  </pic:spPr>
-                </pic:pic>
-              </a:graphicData>
-            </a:graphic>
-            <wp14:sizeRelH relativeFrom="page">
-              <wp14:pctWidth>0</wp14:pctWidth>
-            </wp14:sizeRelH>
-            <wp14:sizeRelV relativeFrom="page">
-              <wp14:pctHeight>0</wp14:pctHeight>
-            </wp14:sizeRelV>
-          </wp:anchor>
-        </w:drawing>
-      </w:r>
-      <w:r>
-        <w:rPr>
-          <w:noProof/>
-        </w:rPr>
-        <mc:AlternateContent>
-          <mc:Choice Requires="wps">
-            <w:drawing>
-              <wp:anchor distT="0" distB="0" distL="114300" distR="114300" simplePos="0" relativeHeight="251670528" behindDoc="0" locked="0" layoutInCell="1" allowOverlap="1" wp14:anchorId="10C35BE6" wp14:editId="064149AE">
-                <wp:simplePos x="0" y="0"/>
-                <wp:positionH relativeFrom="column">
-                  <wp:posOffset>969010</wp:posOffset>
-                </wp:positionH>
-                <wp:positionV relativeFrom="paragraph">
-                  <wp:posOffset>3601085</wp:posOffset>
-                </wp:positionV>
-                <wp:extent cx="2489493" cy="792000"/>
-                <wp:effectExtent l="0" t="0" r="6350" b="8255"/>
-                <wp:wrapNone/>
-                <wp:docPr id="1911675260" name="Rectangle: Rounded Corners 4"/>
-                <wp:cNvGraphicFramePr/>
-                <a:graphic xmlns:a="http://schemas.openxmlformats.org/drawingml/2006/main">
-                  <a:graphicData uri="http://schemas.microsoft.com/office/word/2010/wordprocessingShape">
-                    <wps:wsp>
-                      <wps:cNvSpPr/>
-                      <wps:spPr>
-                        <a:xfrm>
-                          <a:off x="0" y="0"/>
-                          <a:ext cx="2489493" cy="792000"/>
-                        </a:xfrm>
-                        <a:prstGeom prst="roundRect">
-                          <a:avLst/>
-                        </a:prstGeom>
-                        <a:solidFill>
-                          <a:schemeClr val="tx2">
-                            <a:alpha val="65098"/>
-                          </a:schemeClr>
-                        </a:solidFill>
-                        <a:ln>
-                          <a:noFill/>
-                        </a:ln>
-                      </wps:spPr>
-                      <wps:style>
-                        <a:lnRef idx="2">
-                          <a:schemeClr val="accent1">
-                            <a:shade val="15000"/>
-                          </a:schemeClr>
-                        </a:lnRef>
-                        <a:fillRef idx="1">
-                          <a:schemeClr val="accent1"/>
-                        </a:fillRef>
-                        <a:effectRef idx="0">
-                          <a:schemeClr val="accent1"/>
-                        </a:effectRef>
-                        <a:fontRef idx="minor">
-                          <a:schemeClr val="lt1"/>
-                        </a:fontRef>
-                      </wps:style>
-                      <wps:bodyPr rot="0" spcFirstLastPara="0" vertOverflow="overflow" horzOverflow="overflow" vert="horz" wrap="square" lIns="91440" tIns="45720" rIns="91440" bIns="45720" numCol="1" spcCol="0" rtlCol="0" fromWordArt="0" anchor="ctr" anchorCtr="0" forceAA="0" compatLnSpc="1">
-                        <a:prstTxWarp prst="textNoShape">
-                          <a:avLst/>
-                        </a:prstTxWarp>
-                        <a:noAutofit/>
-                      </wps:bodyPr>
-                    </wps:wsp>
-                  </a:graphicData>
-                </a:graphic>
-                <wp14:sizeRelH relativeFrom="margin">
-                  <wp14:pctWidth>0</wp14:pctWidth>
-                </wp14:sizeRelH>
-                <wp14:sizeRelV relativeFrom="margin">
-                  <wp14:pctHeight>0</wp14:pctHeight>
-                </wp14:sizeRelV>
-              </wp:anchor>
-            </w:drawing>
-          </mc:Choice>
-          <mc:Fallback>
-            <w:pict>
-              <v:roundrect w14:anchorId="1D57EB77" id="Rectangle: Rounded Corners 4" o:spid="_x0000_s1026" style="position:absolute;margin-left:76.3pt;margin-top:283.55pt;width:196pt;height:62.35pt;z-index:251670528;visibility:visible;mso-wrap-style:square;mso-width-percent:0;mso-height-percent:0;mso-wrap-distance-left:9pt;mso-wrap-distance-top:0;mso-wrap-distance-right:9pt;mso-wrap-distance-bottom:0;mso-position-horizontal:absolute;mso-position-horizontal-relative:text;mso-position-vertical:absolute;mso-position-vertical-relative:text;mso-width-percent:0;mso-height-percent:0;mso-width-relative:margin;mso-height-relative:margin;v-text-anchor:middle" arcsize="10923f" o:gfxdata="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" fillcolor="#0e2841 [3215]" stroked="f" strokeweight="1.5pt">
-                <v:fill opacity="42662f"/>
-                <v:stroke joinstyle="miter"/>
-              </v:roundrect>
-            </w:pict>
-          </mc:Fallback>
-        </mc:AlternateContent>
-      </w:r>
-      <w:r>
-        <w:rPr>
-          <w:noProof/>
-        </w:rPr>
-        <mc:AlternateContent>
-          <mc:Choice Requires="wps">
-            <w:drawing>
-              <wp:anchor distT="0" distB="0" distL="114300" distR="114300" simplePos="0" relativeHeight="251673600" behindDoc="0" locked="0" layoutInCell="1" allowOverlap="1" wp14:anchorId="6D73313E" wp14:editId="586553B3">
-                <wp:simplePos x="0" y="0"/>
-                <wp:positionH relativeFrom="column">
-                  <wp:posOffset>1211580</wp:posOffset>
-                </wp:positionH>
-                <wp:positionV relativeFrom="paragraph">
-                  <wp:posOffset>3209925</wp:posOffset>
-                </wp:positionV>
-                <wp:extent cx="2140647" cy="295003"/>
-                <wp:effectExtent l="0" t="0" r="0" b="0"/>
-                <wp:wrapNone/>
-                <wp:docPr id="1171198375" name="Rectangle: Rounded Corners 4"/>
-                <wp:cNvGraphicFramePr/>
-                <a:graphic xmlns:a="http://schemas.openxmlformats.org/drawingml/2006/main">
-                  <a:graphicData uri="http://schemas.microsoft.com/office/word/2010/wordprocessingShape">
-                    <wps:wsp>
-                      <wps:cNvSpPr/>
-                      <wps:spPr>
-                        <a:xfrm>
-                          <a:off x="0" y="0"/>
-                          <a:ext cx="2140647" cy="295003"/>
-                        </a:xfrm>
-                        <a:prstGeom prst="roundRect">
-                          <a:avLst/>
-                        </a:prstGeom>
-                        <a:solidFill>
-                          <a:schemeClr val="tx2">
-                            <a:alpha val="65098"/>
-                          </a:schemeClr>
-                        </a:solidFill>
-                        <a:ln>
-                          <a:noFill/>
-                        </a:ln>
-                      </wps:spPr>
-                      <wps:style>
-                        <a:lnRef idx="2">
-                          <a:schemeClr val="accent1">
-                            <a:shade val="15000"/>
-                          </a:schemeClr>
-                        </a:lnRef>
-                        <a:fillRef idx="1">
-                          <a:schemeClr val="accent1"/>
-                        </a:fillRef>
-                        <a:effectRef idx="0">
-                          <a:schemeClr val="accent1"/>
-                        </a:effectRef>
-                        <a:fontRef idx="minor">
-                          <a:schemeClr val="lt1"/>
-                        </a:fontRef>
-                      </wps:style>
-                      <wps:bodyPr rot="0" spcFirstLastPara="0" vertOverflow="overflow" horzOverflow="overflow" vert="horz" wrap="square" lIns="91440" tIns="45720" rIns="91440" bIns="45720" numCol="1" spcCol="0" rtlCol="0" fromWordArt="0" anchor="ctr" anchorCtr="0" forceAA="0" compatLnSpc="1">
-                        <a:prstTxWarp prst="textNoShape">
-                          <a:avLst/>
-                        </a:prstTxWarp>
-                        <a:noAutofit/>
-                      </wps:bodyPr>
-                    </wps:wsp>
-                  </a:graphicData>
-                </a:graphic>
-                <wp14:sizeRelH relativeFrom="margin">
-                  <wp14:pctWidth>0</wp14:pctWidth>
-                </wp14:sizeRelH>
-                <wp14:sizeRelV relativeFrom="margin">
-                  <wp14:pctHeight>0</wp14:pctHeight>
-                </wp14:sizeRelV>
-              </wp:anchor>
-            </w:drawing>
-          </mc:Choice>
-          <mc:Fallback>
-            <w:pict>
-              <v:roundrect w14:anchorId="679E1117" id="Rectangle: Rounded Corners 4" o:spid="_x0000_s1026" style="position:absolute;margin-left:95.4pt;margin-top:252.75pt;width:168.55pt;height:23.25pt;z-index:251673600;visibility:visible;mso-wrap-style:square;mso-width-percent:0;mso-height-percent:0;mso-wrap-distance-left:9pt;mso-wrap-distance-top:0;mso-wrap-distance-right:9pt;mso-wrap-distance-bottom:0;mso-position-horizontal:absolute;mso-position-horizontal-relative:text;mso-position-vertical:absolute;mso-position-vertical-relative:text;mso-width-percent:0;mso-height-percent:0;mso-width-relative:margin;mso-height-relative:margin;v-text-anchor:middle" arcsize="10923f" o:gfxdata="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" fillcolor="#0e2841 [3215]" stroked="f" strokeweight="1.5pt">
-                <v:fill opacity="42662f"/>
-                <v:stroke joinstyle="miter"/>
-              </v:roundrect>
-            </w:pict>
-          </mc:Fallback>
-        </mc:AlternateContent>
-      </w:r>
-      <w:r>
-        <w:rPr>
-          <w:noProof/>
-        </w:rPr>
-        <w:drawing>
-          <wp:anchor distT="0" distB="0" distL="114300" distR="114300" simplePos="0" relativeHeight="251675648" behindDoc="0" locked="0" layoutInCell="1" allowOverlap="1" wp14:anchorId="6FD1B039" wp14:editId="5A6275D0">
-            <wp:simplePos x="0" y="0"/>
-            <wp:positionH relativeFrom="margin">
-              <wp:posOffset>1268095</wp:posOffset>
-            </wp:positionH>
-            <wp:positionV relativeFrom="paragraph">
-              <wp:posOffset>3228975</wp:posOffset>
-            </wp:positionV>
-            <wp:extent cx="251460" cy="251460"/>
-            <wp:effectExtent l="0" t="0" r="0" b="0"/>
-            <wp:wrapNone/>
-            <wp:docPr id="876116257" name="Graphic 7" descr="Hike with solid fill"/>
-            <wp:cNvGraphicFramePr>
-              <a:graphicFrameLocks xmlns:a="http://schemas.openxmlformats.org/drawingml/2006/main" noChangeAspect="1"/>
-            </wp:cNvGraphicFramePr>
-            <a:graphic xmlns:a="http://schemas.openxmlformats.org/drawingml/2006/main">
-              <a:graphicData uri="http://schemas.openxmlformats.org/drawingml/2006/picture">
-                <pic:pic xmlns:pic="http://schemas.openxmlformats.org/drawingml/2006/picture">
-                  <pic:nvPicPr>
-                    <pic:cNvPr id="875668785" name="Graphic 875668785" descr="Hike with solid fill"/>
-                    <pic:cNvPicPr/>
-                  </pic:nvPicPr>
-                  <pic:blipFill>
-                    <a:blip r:embed="rId6">
-                      <a:extLst>
-                        <a:ext uri="{96DAC541-7B7A-43D3-8B79-37D633B846F1}">
-                          <asvg:svgBlip xmlns:asvg="http://schemas.microsoft.com/office/drawing/2016/SVG/main" r:embed="rId7"/>
-                        </a:ext>
-                      </a:extLst>
-                    </a:blip>
-                    <a:stretch>
-                      <a:fillRect/>
-                    </a:stretch>
-                  </pic:blipFill>
-                  <pic:spPr>
-                    <a:xfrm>
-                      <a:off x="0" y="0"/>
-                      <a:ext cx="251460" cy="251460"/>
-                    </a:xfrm>
-                    <a:prstGeom prst="rect">
-                      <a:avLst/>
-                    </a:prstGeom>
-                  </pic:spPr>
-                </pic:pic>
-              </a:graphicData>
-            </a:graphic>
-            <wp14:sizeRelH relativeFrom="page">
-              <wp14:pctWidth>0</wp14:pctWidth>
-            </wp14:sizeRelH>
-            <wp14:sizeRelV relativeFrom="page">
-              <wp14:pctHeight>0</wp14:pctHeight>
-            </wp14:sizeRelV>
-          </wp:anchor>
-        </w:drawing>
-      </w:r>
-      <w:r>
-        <w:rPr>
-          <w:noProof/>
-        </w:rPr>
-        <w:drawing>
-          <wp:anchor distT="0" distB="0" distL="114300" distR="114300" simplePos="0" relativeHeight="251676672" behindDoc="0" locked="0" layoutInCell="1" allowOverlap="1" wp14:anchorId="0E4E9730" wp14:editId="780AD21E">
+          <wp:anchor distT="0" distB="0" distL="114300" distR="114300" simplePos="0" relativeHeight="251676672" behindDoc="0" locked="0" layoutInCell="1" allowOverlap="1" wp14:anchorId="0E4E9730" wp14:editId="0AED978E">
             <wp:simplePos x="0" y="0"/>
             <wp:positionH relativeFrom="column">
               <wp:posOffset>48260</wp:posOffset>
@@ -1824,10 +2401,10 @@
                     <pic:cNvPicPr/>
                   </pic:nvPicPr>
                   <pic:blipFill>
-                    <a:blip r:embed="rId12">
+                    <a:blip r:embed="rId17">
                       <a:extLst>
                         <a:ext uri="{96DAC541-7B7A-43D3-8B79-37D633B846F1}">
-                          <asvg:svgBlip xmlns:asvg="http://schemas.microsoft.com/office/drawing/2016/SVG/main" r:embed="rId13"/>
+                          <asvg:svgBlip xmlns:asvg="http://schemas.microsoft.com/office/drawing/2016/SVG/main" r:embed="rId18"/>
                         </a:ext>
                       </a:extLst>
                     </a:blip>
@@ -1839,66 +2416,6 @@
                     <a:xfrm>
                       <a:off x="0" y="0"/>
                       <a:ext cx="828000" cy="828000"/>
-                    </a:xfrm>
-                    <a:prstGeom prst="rect">
-                      <a:avLst/>
-                    </a:prstGeom>
-                  </pic:spPr>
-                </pic:pic>
-              </a:graphicData>
-            </a:graphic>
-            <wp14:sizeRelH relativeFrom="page">
-              <wp14:pctWidth>0</wp14:pctWidth>
-            </wp14:sizeRelH>
-            <wp14:sizeRelV relativeFrom="page">
-              <wp14:pctHeight>0</wp14:pctHeight>
-            </wp14:sizeRelV>
-          </wp:anchor>
-        </w:drawing>
-      </w:r>
-      <w:r>
-        <w:rPr>
-          <w:noProof/>
-        </w:rPr>
-        <w:drawing>
-          <wp:anchor distT="0" distB="0" distL="114300" distR="114300" simplePos="0" relativeHeight="251677696" behindDoc="0" locked="0" layoutInCell="1" allowOverlap="1" wp14:anchorId="522BC641" wp14:editId="7461811B">
-            <wp:simplePos x="0" y="0"/>
-            <wp:positionH relativeFrom="column">
-              <wp:posOffset>83820</wp:posOffset>
-            </wp:positionH>
-            <wp:positionV relativeFrom="paragraph">
-              <wp:posOffset>3601720</wp:posOffset>
-            </wp:positionV>
-            <wp:extent cx="792000" cy="792000"/>
-            <wp:effectExtent l="0" t="0" r="8255" b="8255"/>
-            <wp:wrapNone/>
-            <wp:docPr id="808012529" name="Graphic 1"/>
-            <wp:cNvGraphicFramePr>
-              <a:graphicFrameLocks xmlns:a="http://schemas.openxmlformats.org/drawingml/2006/main" noChangeAspect="1"/>
-            </wp:cNvGraphicFramePr>
-            <a:graphic xmlns:a="http://schemas.openxmlformats.org/drawingml/2006/main">
-              <a:graphicData uri="http://schemas.openxmlformats.org/drawingml/2006/picture">
-                <pic:pic xmlns:pic="http://schemas.openxmlformats.org/drawingml/2006/picture">
-                  <pic:nvPicPr>
-                    <pic:cNvPr id="808012529" name="Graphic 808012529"/>
-                    <pic:cNvPicPr/>
-                  </pic:nvPicPr>
-                  <pic:blipFill>
-                    <a:blip r:embed="rId14">
-                      <a:extLst>
-                        <a:ext uri="{96DAC541-7B7A-43D3-8B79-37D633B846F1}">
-                          <asvg:svgBlip xmlns:asvg="http://schemas.microsoft.com/office/drawing/2016/SVG/main" r:embed="rId15"/>
-                        </a:ext>
-                      </a:extLst>
-                    </a:blip>
-                    <a:stretch>
-                      <a:fillRect/>
-                    </a:stretch>
-                  </pic:blipFill>
-                  <pic:spPr>
-                    <a:xfrm>
-                      <a:off x="0" y="0"/>
-                      <a:ext cx="792000" cy="792000"/>
                     </a:xfrm>
                     <a:prstGeom prst="rect">
                       <a:avLst/>
@@ -2327,7 +2844,7 @@
   <w:style w:type="paragraph" w:default="1" w:styleId="Normal">
     <w:name w:val="Normal"/>
     <w:qFormat/>
-    <w:rsid w:val="0049420F"/>
+    <w:rsid w:val="006E1C2E"/>
   </w:style>
   <w:style w:type="paragraph" w:styleId="Heading1">
     <w:name w:val="heading 1"/>
@@ -2531,7 +3048,6 @@
   <w:style w:type="character" w:default="1" w:styleId="DefaultParagraphFont">
     <w:name w:val="Default Paragraph Font"/>
     <w:uiPriority w:val="1"/>
-    <w:semiHidden/>
     <w:unhideWhenUsed/>
   </w:style>
   <w:style w:type="table" w:default="1" w:styleId="TableNormal">

</xml_diff>